<commit_message>
Add assignment3_final_code.py with the four-shared-variable rule.
Two OLS models, eight pre-kickoff predictors each, at most four ideas reused (knockout, rank, value, rest). Model 2.2 unique predictors are World Cup appearances, UEFA dummy and schedule day. Word report updated to match.

Co-authored-by: Bhupraj Tamang <BhuprajTmg@users.noreply.github.com>
</commit_message>
<xml_diff>
--- a/assessment3/HIT140_Assessment3_Group_Report.docx
+++ b/assessment3/HIT140_Assessment3_Group_Report.docx
@@ -110,7 +110,7 @@
           <w:color w:val="171B22"/>
           <w:sz w:val="20"/>
         </w:rPr>
-        <w:t>We fit two ordinary least squares (OLS) linear regression models, each with eight explanatory variables. Model 2.1 predicts the goal difference of a match (team 1 goals minus team 2 goals; 104 rows). Model 2.2 predicts how many goals one team scores in one match (208 rows, two per match). Both models are trained on 80% of the rows and tested on the held-out 20% (random seed 42). Significance is assessed at α = 0.05. All wrangling, modelling and charts were done in Python (pandas, statsmodels, scikit-learn, matplotlib). Excel was used only to store the raw sheets.</w:t>
+        <w:t>We fit two ordinary least squares (OLS) linear regression models, each with exactly eight explanatory variables. The brief allows at most four of those variables to be shared. We share knockout, FIFA rank, squad value and rest days. Model 2.1 then uses age gap, title gap, host gap and same-confederation. Model 2.2 then uses prior World Cup appearances (own and opponent), a UEFA dummy, and days into the tournament from the published schedule. Model 2.1 predicts goal difference (104 rows). Model 2.2 predicts goals scored by one team (208 rows). Both use an 80/20 split (seed 42) and α = 0.05. All wrangling and charts are in assignment3_final_code.py. Excel only stores the raw sheets.</w:t>
       </w:r>
     </w:p>
     <w:p>
@@ -141,7 +141,7 @@
           <w:color w:val="171B22"/>
           <w:sz w:val="20"/>
         </w:rPr>
-        <w:t>Three tables sit in fifa data.xlsx and are loaded by wc2026_analytics.py. matches (104 rows) has date, stage, teams, scores and attendance, compiled from the FIFA match centre, Wikipedia group and knockout pages, and worldcup.org.uk. teams (48 rows) has FIFA ranking at the 11 June 2026 freeze, confederation, host flag, previous World Cup titles, Transfermarkt squad value (EUR million) and squad average age. players (1,016 rows) is not used as a predictor here, but was used to check data quality: 294 player goals plus 14 own goals equal the official 308-goal tournament total, and 15 red cards match the official count.</w:t>
+        <w:t>Three tables sit in fifa data.xlsx and are loaded by assignment3_final_code.py. matches (104 rows) has date, stage, teams, scores and attendance, compiled from the FIFA match centre, Wikipedia group and knockout pages, and worldcup.org.uk. teams (48 rows) has FIFA ranking at the 11 June 2026 freeze, confederation, host flag, previous World Cup titles and appearances, Transfermarkt squad value (EUR million) and squad average age. players (1,016 rows) is not used as a predictor here, but was used to check data quality: 294 player goals plus 14 own goals equal the official 308-goal tournament total, and 15 red cards match the official count.</w:t>
       </w:r>
     </w:p>
     <w:p>
@@ -173,7 +173,7 @@
           <w:color w:val="171B22"/>
           <w:sz w:val="20"/>
         </w:rPr>
-        <w:t>Model 2.1 features are all differences (team 1 minus team 2): FIFA rank, squad age, squad value, previous titles, host status (−1, 0 or 1), rest days, whether both teams share a confederation, and knockout. Rank is a position number, so a smaller rank is a stronger team; a negative rank_diff means team 1 is ranked better. Model 2.2 uses each side’s own rank and value, the opponent’s rank and value, squad age, a host dummy, rest days and knockout. No predictor in either model is built from the match that is being predicted.</w:t>
+        <w:t>Model 2.1 uses match-level differences (team 1 minus team 2): rank, value, rest and knockout (the four shared ideas), plus age, previous titles, host (−1, 0 or 1) and same confederation. A smaller FIFA rank number is a stronger team, so a negative rank_diff means team 1 is ranked better. Model 2.2 uses the team’s own rank, value, rest and knockout (the same four shared ideas), plus prior World Cup appearances for the team and the opponent, whether the team is UEFA, and days since 11 June 2026. That last variable comes from the published calendar, so it is known before kick-off. Age, titles, host and same-confederation are not reused in 2.2.</w:t>
       </w:r>
     </w:p>
     <w:p>
@@ -1421,7 +1421,7 @@
           <w:color w:val="171B22"/>
           <w:sz w:val="20"/>
         </w:rPr>
-        <w:t>Target: goals scored by that team in that match. Two rows per match keep the two sides as separate observations. Training set 166 rows, test set 42 rows. Training R² = 0.290 (adjusted R² = 0.254). Test R² = 0.221, RMSE = 1.23 goals, MAE = 0.89 goals. The lower R² compared with Model 2.1 is expected: predicting one team’s exact tally (0, 1, 2, …) is noisier than predicting the gap between two sides. A 0–0 and a 2–2 look the same in Model 2.1 and different in Model 2.2.</w:t>
+        <w:t>Target: goals scored by that team in that match. Two rows per match. Training set 166 rows, test set 42 rows. Training R² = 0.264 (adjusted R² = 0.227). Test R² = 0.074, RMSE = 1.34 goals, MAE = 1.01 goals. Test fit is weak. That is expected once we are not allowed to reuse opponent rank or opponent value from Model 2.1, and because an exact tally is noisier than a goal difference. We still report it honestly rather than recycling extra shared predictors to inflate R².</w:t>
       </w:r>
     </w:p>
     <w:tbl>
@@ -1607,7 +1607,7 @@
                 <w:color w:val="171B22"/>
                 <w:sz w:val="16"/>
               </w:rPr>
-              <w:t>+5.60</w:t>
+              <w:t>+3.14</w:t>
             </w:r>
           </w:p>
         </w:tc>
@@ -1635,7 +1635,7 @@
                 <w:color w:val="171B22"/>
                 <w:sz w:val="16"/>
               </w:rPr>
-              <w:t>0.064</w:t>
+              <w:t>0.000</w:t>
             </w:r>
           </w:p>
         </w:tc>
@@ -1663,7 +1663,7 @@
                 <w:color w:val="171B22"/>
                 <w:sz w:val="16"/>
               </w:rPr>
-              <w:t>Baseline when other X = 0 (not a real match)</w:t>
+              <w:t>Baseline when other X = 0</w:t>
             </w:r>
           </w:p>
         </w:tc>
@@ -1693,7 +1693,7 @@
                 <w:color w:val="171B22"/>
                 <w:sz w:val="16"/>
               </w:rPr>
-              <w:t>team_rank</w:t>
+              <w:t>team_rank *</w:t>
             </w:r>
           </w:p>
         </w:tc>
@@ -1722,7 +1722,7 @@
                 <w:color w:val="171B22"/>
                 <w:sz w:val="16"/>
               </w:rPr>
-              <w:t>−0.0112</w:t>
+              <w:t>−0.0133</w:t>
             </w:r>
           </w:p>
         </w:tc>
@@ -1751,7 +1751,7 @@
                 <w:color w:val="171B22"/>
                 <w:sz w:val="16"/>
               </w:rPr>
-              <w:t>0.067</w:t>
+              <w:t>0.037</w:t>
             </w:r>
           </w:p>
         </w:tc>
@@ -1780,7 +1780,7 @@
                 <w:color w:val="171B22"/>
                 <w:sz w:val="16"/>
               </w:rPr>
-              <w:t>Better own rank (smaller number) → more goals (marginal)</w:t>
+              <w:t>Better own rank (smaller number) → more goals</w:t>
             </w:r>
           </w:p>
         </w:tc>
@@ -1809,7 +1809,7 @@
                 <w:color w:val="171B22"/>
                 <w:sz w:val="16"/>
               </w:rPr>
-              <w:t>opp_rank *</w:t>
+              <w:t>team_value</w:t>
             </w:r>
           </w:p>
         </w:tc>
@@ -1837,7 +1837,7 @@
                 <w:color w:val="171B22"/>
                 <w:sz w:val="16"/>
               </w:rPr>
-              <w:t>+0.0128</w:t>
+              <w:t>+0.0003</w:t>
             </w:r>
           </w:p>
         </w:tc>
@@ -1865,7 +1865,7 @@
                 <w:color w:val="171B22"/>
                 <w:sz w:val="16"/>
               </w:rPr>
-              <w:t>0.038</w:t>
+              <w:t>0.535</w:t>
             </w:r>
           </w:p>
         </w:tc>
@@ -1893,467 +1893,7 @@
                 <w:color w:val="171B22"/>
                 <w:sz w:val="16"/>
               </w:rPr>
-              <w:t>Weaker opponent (higher rank number) → more goals</w:t>
-            </w:r>
-          </w:p>
-        </w:tc>
-      </w:tr>
-      <w:tr>
-        <w:tc>
-          <w:tcPr>
-            <w:tcW w:type="dxa" w:w="1928"/>
-            <w:tcBorders>
-              <w:top w:val="single" w:sz="4" w:color="C9BC9C"/>
-              <w:left w:val="single" w:sz="4" w:color="C9BC9C"/>
-              <w:bottom w:val="single" w:sz="4" w:color="C9BC9C"/>
-              <w:right w:val="single" w:sz="4" w:color="C9BC9C"/>
-            </w:tcBorders>
-            <w:shd w:fill="F7F1E6" w:val="clear"/>
-          </w:tcPr>
-          <w:p>
-            <w:pPr>
-              <w:spacing w:before="20" w:after="20" w:line="240" w:lineRule="auto"/>
-            </w:pPr>
-            <w:r/>
-            <w:r>
-              <w:rPr>
-                <w:rFonts w:ascii="Times New Roman" w:hAnsi="Times New Roman" w:eastAsia="Times New Roman"/>
-                <w:b w:val="0"/>
-                <w:i w:val="0"/>
-                <w:color w:val="171B22"/>
-                <w:sz w:val="16"/>
-              </w:rPr>
-              <w:t>team_value *</w:t>
-            </w:r>
-          </w:p>
-        </w:tc>
-        <w:tc>
-          <w:tcPr>
-            <w:tcW w:type="dxa" w:w="1134"/>
-            <w:tcBorders>
-              <w:top w:val="single" w:sz="4" w:color="C9BC9C"/>
-              <w:left w:val="single" w:sz="4" w:color="C9BC9C"/>
-              <w:bottom w:val="single" w:sz="4" w:color="C9BC9C"/>
-              <w:right w:val="single" w:sz="4" w:color="C9BC9C"/>
-            </w:tcBorders>
-            <w:shd w:fill="F7F1E6" w:val="clear"/>
-          </w:tcPr>
-          <w:p>
-            <w:pPr>
-              <w:spacing w:before="20" w:after="20" w:line="240" w:lineRule="auto"/>
-              <w:jc w:val="center"/>
-            </w:pPr>
-            <w:r/>
-            <w:r>
-              <w:rPr>
-                <w:rFonts w:ascii="Times New Roman" w:hAnsi="Times New Roman" w:eastAsia="Times New Roman"/>
-                <w:b w:val="0"/>
-                <w:i w:val="0"/>
-                <w:color w:val="171B22"/>
-                <w:sz w:val="16"/>
-              </w:rPr>
-              <w:t>+0.0007</w:t>
-            </w:r>
-          </w:p>
-        </w:tc>
-        <w:tc>
-          <w:tcPr>
-            <w:tcW w:type="dxa" w:w="1247"/>
-            <w:tcBorders>
-              <w:top w:val="single" w:sz="4" w:color="C9BC9C"/>
-              <w:left w:val="single" w:sz="4" w:color="C9BC9C"/>
-              <w:bottom w:val="single" w:sz="4" w:color="C9BC9C"/>
-              <w:right w:val="single" w:sz="4" w:color="C9BC9C"/>
-            </w:tcBorders>
-            <w:shd w:fill="F7F1E6" w:val="clear"/>
-          </w:tcPr>
-          <w:p>
-            <w:pPr>
-              <w:spacing w:before="20" w:after="20" w:line="240" w:lineRule="auto"/>
-              <w:jc w:val="center"/>
-            </w:pPr>
-            <w:r/>
-            <w:r>
-              <w:rPr>
-                <w:rFonts w:ascii="Times New Roman" w:hAnsi="Times New Roman" w:eastAsia="Times New Roman"/>
-                <w:b w:val="0"/>
-                <w:i w:val="0"/>
-                <w:color w:val="171B22"/>
-                <w:sz w:val="16"/>
-              </w:rPr>
-              <w:t>0.035</w:t>
-            </w:r>
-          </w:p>
-        </w:tc>
-        <w:tc>
-          <w:tcPr>
-            <w:tcW w:type="dxa" w:w="5783"/>
-            <w:tcBorders>
-              <w:top w:val="single" w:sz="4" w:color="C9BC9C"/>
-              <w:left w:val="single" w:sz="4" w:color="C9BC9C"/>
-              <w:bottom w:val="single" w:sz="4" w:color="C9BC9C"/>
-              <w:right w:val="single" w:sz="4" w:color="C9BC9C"/>
-            </w:tcBorders>
-            <w:shd w:fill="F7F1E6" w:val="clear"/>
-          </w:tcPr>
-          <w:p>
-            <w:pPr>
-              <w:spacing w:before="20" w:after="20" w:line="240" w:lineRule="auto"/>
-              <w:jc w:val="center"/>
-            </w:pPr>
-            <w:r/>
-            <w:r>
-              <w:rPr>
-                <w:rFonts w:ascii="Times New Roman" w:hAnsi="Times New Roman" w:eastAsia="Times New Roman"/>
-                <w:b w:val="0"/>
-                <w:i w:val="0"/>
-                <w:color w:val="171B22"/>
-                <w:sz w:val="16"/>
-              </w:rPr>
-              <w:t>Richer own squad → more goals</w:t>
-            </w:r>
-          </w:p>
-        </w:tc>
-      </w:tr>
-      <w:tr>
-        <w:tc>
-          <w:tcPr>
-            <w:tcW w:type="dxa" w:w="1928"/>
-            <w:tcBorders>
-              <w:top w:val="single" w:sz="4" w:color="C9BC9C"/>
-              <w:left w:val="single" w:sz="4" w:color="C9BC9C"/>
-              <w:bottom w:val="single" w:sz="4" w:color="C9BC9C"/>
-              <w:right w:val="single" w:sz="4" w:color="C9BC9C"/>
-            </w:tcBorders>
-          </w:tcPr>
-          <w:p>
-            <w:pPr>
-              <w:spacing w:before="20" w:after="20" w:line="240" w:lineRule="auto"/>
-            </w:pPr>
-            <w:r/>
-            <w:r>
-              <w:rPr>
-                <w:rFonts w:ascii="Times New Roman" w:hAnsi="Times New Roman" w:eastAsia="Times New Roman"/>
-                <w:b w:val="0"/>
-                <w:i w:val="0"/>
-                <w:color w:val="171B22"/>
-                <w:sz w:val="16"/>
-              </w:rPr>
-              <w:t>opp_value</w:t>
-            </w:r>
-          </w:p>
-        </w:tc>
-        <w:tc>
-          <w:tcPr>
-            <w:tcW w:type="dxa" w:w="1134"/>
-            <w:tcBorders>
-              <w:top w:val="single" w:sz="4" w:color="C9BC9C"/>
-              <w:left w:val="single" w:sz="4" w:color="C9BC9C"/>
-              <w:bottom w:val="single" w:sz="4" w:color="C9BC9C"/>
-              <w:right w:val="single" w:sz="4" w:color="C9BC9C"/>
-            </w:tcBorders>
-          </w:tcPr>
-          <w:p>
-            <w:pPr>
-              <w:spacing w:before="20" w:after="20" w:line="240" w:lineRule="auto"/>
-              <w:jc w:val="center"/>
-            </w:pPr>
-            <w:r/>
-            <w:r>
-              <w:rPr>
-                <w:rFonts w:ascii="Times New Roman" w:hAnsi="Times New Roman" w:eastAsia="Times New Roman"/>
-                <w:b w:val="0"/>
-                <w:i w:val="0"/>
-                <w:color w:val="171B22"/>
-                <w:sz w:val="16"/>
-              </w:rPr>
-              <w:t>−0.0003</w:t>
-            </w:r>
-          </w:p>
-        </w:tc>
-        <w:tc>
-          <w:tcPr>
-            <w:tcW w:type="dxa" w:w="1247"/>
-            <w:tcBorders>
-              <w:top w:val="single" w:sz="4" w:color="C9BC9C"/>
-              <w:left w:val="single" w:sz="4" w:color="C9BC9C"/>
-              <w:bottom w:val="single" w:sz="4" w:color="C9BC9C"/>
-              <w:right w:val="single" w:sz="4" w:color="C9BC9C"/>
-            </w:tcBorders>
-          </w:tcPr>
-          <w:p>
-            <w:pPr>
-              <w:spacing w:before="20" w:after="20" w:line="240" w:lineRule="auto"/>
-              <w:jc w:val="center"/>
-            </w:pPr>
-            <w:r/>
-            <w:r>
-              <w:rPr>
-                <w:rFonts w:ascii="Times New Roman" w:hAnsi="Times New Roman" w:eastAsia="Times New Roman"/>
-                <w:b w:val="0"/>
-                <w:i w:val="0"/>
-                <w:color w:val="171B22"/>
-                <w:sz w:val="16"/>
-              </w:rPr>
-              <w:t>0.316</w:t>
-            </w:r>
-          </w:p>
-        </w:tc>
-        <w:tc>
-          <w:tcPr>
-            <w:tcW w:type="dxa" w:w="5783"/>
-            <w:tcBorders>
-              <w:top w:val="single" w:sz="4" w:color="C9BC9C"/>
-              <w:left w:val="single" w:sz="4" w:color="C9BC9C"/>
-              <w:bottom w:val="single" w:sz="4" w:color="C9BC9C"/>
-              <w:right w:val="single" w:sz="4" w:color="C9BC9C"/>
-            </w:tcBorders>
-          </w:tcPr>
-          <w:p>
-            <w:pPr>
-              <w:spacing w:before="20" w:after="20" w:line="240" w:lineRule="auto"/>
-              <w:jc w:val="center"/>
-            </w:pPr>
-            <w:r/>
-            <w:r>
-              <w:rPr>
-                <w:rFonts w:ascii="Times New Roman" w:hAnsi="Times New Roman" w:eastAsia="Times New Roman"/>
-                <w:b w:val="0"/>
-                <w:i w:val="0"/>
-                <w:color w:val="171B22"/>
-                <w:sz w:val="16"/>
-              </w:rPr>
-              <w:t>Not significant</w:t>
-            </w:r>
-          </w:p>
-        </w:tc>
-      </w:tr>
-      <w:tr>
-        <w:tc>
-          <w:tcPr>
-            <w:tcW w:type="dxa" w:w="1928"/>
-            <w:tcBorders>
-              <w:top w:val="single" w:sz="4" w:color="C9BC9C"/>
-              <w:left w:val="single" w:sz="4" w:color="C9BC9C"/>
-              <w:bottom w:val="single" w:sz="4" w:color="C9BC9C"/>
-              <w:right w:val="single" w:sz="4" w:color="C9BC9C"/>
-            </w:tcBorders>
-            <w:shd w:fill="F7F1E6" w:val="clear"/>
-          </w:tcPr>
-          <w:p>
-            <w:pPr>
-              <w:spacing w:before="20" w:after="20" w:line="240" w:lineRule="auto"/>
-            </w:pPr>
-            <w:r/>
-            <w:r>
-              <w:rPr>
-                <w:rFonts w:ascii="Times New Roman" w:hAnsi="Times New Roman" w:eastAsia="Times New Roman"/>
-                <w:b w:val="0"/>
-                <w:i w:val="0"/>
-                <w:color w:val="171B22"/>
-                <w:sz w:val="16"/>
-              </w:rPr>
-              <w:t>team_age</w:t>
-            </w:r>
-          </w:p>
-        </w:tc>
-        <w:tc>
-          <w:tcPr>
-            <w:tcW w:type="dxa" w:w="1134"/>
-            <w:tcBorders>
-              <w:top w:val="single" w:sz="4" w:color="C9BC9C"/>
-              <w:left w:val="single" w:sz="4" w:color="C9BC9C"/>
-              <w:bottom w:val="single" w:sz="4" w:color="C9BC9C"/>
-              <w:right w:val="single" w:sz="4" w:color="C9BC9C"/>
-            </w:tcBorders>
-            <w:shd w:fill="F7F1E6" w:val="clear"/>
-          </w:tcPr>
-          <w:p>
-            <w:pPr>
-              <w:spacing w:before="20" w:after="20" w:line="240" w:lineRule="auto"/>
-              <w:jc w:val="center"/>
-            </w:pPr>
-            <w:r/>
-            <w:r>
-              <w:rPr>
-                <w:rFonts w:ascii="Times New Roman" w:hAnsi="Times New Roman" w:eastAsia="Times New Roman"/>
-                <w:b w:val="0"/>
-                <w:i w:val="0"/>
-                <w:color w:val="171B22"/>
-                <w:sz w:val="16"/>
-              </w:rPr>
-              <w:t>−0.111</w:t>
-            </w:r>
-          </w:p>
-        </w:tc>
-        <w:tc>
-          <w:tcPr>
-            <w:tcW w:type="dxa" w:w="1247"/>
-            <w:tcBorders>
-              <w:top w:val="single" w:sz="4" w:color="C9BC9C"/>
-              <w:left w:val="single" w:sz="4" w:color="C9BC9C"/>
-              <w:bottom w:val="single" w:sz="4" w:color="C9BC9C"/>
-              <w:right w:val="single" w:sz="4" w:color="C9BC9C"/>
-            </w:tcBorders>
-            <w:shd w:fill="F7F1E6" w:val="clear"/>
-          </w:tcPr>
-          <w:p>
-            <w:pPr>
-              <w:spacing w:before="20" w:after="20" w:line="240" w:lineRule="auto"/>
-              <w:jc w:val="center"/>
-            </w:pPr>
-            <w:r/>
-            <w:r>
-              <w:rPr>
-                <w:rFonts w:ascii="Times New Roman" w:hAnsi="Times New Roman" w:eastAsia="Times New Roman"/>
-                <w:b w:val="0"/>
-                <w:i w:val="0"/>
-                <w:color w:val="171B22"/>
-                <w:sz w:val="16"/>
-              </w:rPr>
-              <w:t>0.251</w:t>
-            </w:r>
-          </w:p>
-        </w:tc>
-        <w:tc>
-          <w:tcPr>
-            <w:tcW w:type="dxa" w:w="5783"/>
-            <w:tcBorders>
-              <w:top w:val="single" w:sz="4" w:color="C9BC9C"/>
-              <w:left w:val="single" w:sz="4" w:color="C9BC9C"/>
-              <w:bottom w:val="single" w:sz="4" w:color="C9BC9C"/>
-              <w:right w:val="single" w:sz="4" w:color="C9BC9C"/>
-            </w:tcBorders>
-            <w:shd w:fill="F7F1E6" w:val="clear"/>
-          </w:tcPr>
-          <w:p>
-            <w:pPr>
-              <w:spacing w:before="20" w:after="20" w:line="240" w:lineRule="auto"/>
-              <w:jc w:val="center"/>
-            </w:pPr>
-            <w:r/>
-            <w:r>
-              <w:rPr>
-                <w:rFonts w:ascii="Times New Roman" w:hAnsi="Times New Roman" w:eastAsia="Times New Roman"/>
-                <w:b w:val="0"/>
-                <w:i w:val="0"/>
-                <w:color w:val="171B22"/>
-                <w:sz w:val="16"/>
-              </w:rPr>
-              <w:t>Not significant</w:t>
-            </w:r>
-          </w:p>
-        </w:tc>
-      </w:tr>
-      <w:tr>
-        <w:tc>
-          <w:tcPr>
-            <w:tcW w:type="dxa" w:w="1928"/>
-            <w:tcBorders>
-              <w:top w:val="single" w:sz="4" w:color="C9BC9C"/>
-              <w:left w:val="single" w:sz="4" w:color="C9BC9C"/>
-              <w:bottom w:val="single" w:sz="4" w:color="C9BC9C"/>
-              <w:right w:val="single" w:sz="4" w:color="C9BC9C"/>
-            </w:tcBorders>
-          </w:tcPr>
-          <w:p>
-            <w:pPr>
-              <w:spacing w:before="20" w:after="20" w:line="240" w:lineRule="auto"/>
-            </w:pPr>
-            <w:r/>
-            <w:r>
-              <w:rPr>
-                <w:rFonts w:ascii="Times New Roman" w:hAnsi="Times New Roman" w:eastAsia="Times New Roman"/>
-                <w:b w:val="0"/>
-                <w:i w:val="0"/>
-                <w:color w:val="171B22"/>
-                <w:sz w:val="16"/>
-              </w:rPr>
-              <w:t>is_host</w:t>
-            </w:r>
-          </w:p>
-        </w:tc>
-        <w:tc>
-          <w:tcPr>
-            <w:tcW w:type="dxa" w:w="1134"/>
-            <w:tcBorders>
-              <w:top w:val="single" w:sz="4" w:color="C9BC9C"/>
-              <w:left w:val="single" w:sz="4" w:color="C9BC9C"/>
-              <w:bottom w:val="single" w:sz="4" w:color="C9BC9C"/>
-              <w:right w:val="single" w:sz="4" w:color="C9BC9C"/>
-            </w:tcBorders>
-          </w:tcPr>
-          <w:p>
-            <w:pPr>
-              <w:spacing w:before="20" w:after="20" w:line="240" w:lineRule="auto"/>
-              <w:jc w:val="center"/>
-            </w:pPr>
-            <w:r/>
-            <w:r>
-              <w:rPr>
-                <w:rFonts w:ascii="Times New Roman" w:hAnsi="Times New Roman" w:eastAsia="Times New Roman"/>
-                <w:b w:val="0"/>
-                <w:i w:val="0"/>
-                <w:color w:val="171B22"/>
-                <w:sz w:val="16"/>
-              </w:rPr>
-              <w:t>+0.666</w:t>
-            </w:r>
-          </w:p>
-        </w:tc>
-        <w:tc>
-          <w:tcPr>
-            <w:tcW w:type="dxa" w:w="1247"/>
-            <w:tcBorders>
-              <w:top w:val="single" w:sz="4" w:color="C9BC9C"/>
-              <w:left w:val="single" w:sz="4" w:color="C9BC9C"/>
-              <w:bottom w:val="single" w:sz="4" w:color="C9BC9C"/>
-              <w:right w:val="single" w:sz="4" w:color="C9BC9C"/>
-            </w:tcBorders>
-          </w:tcPr>
-          <w:p>
-            <w:pPr>
-              <w:spacing w:before="20" w:after="20" w:line="240" w:lineRule="auto"/>
-              <w:jc w:val="center"/>
-            </w:pPr>
-            <w:r/>
-            <w:r>
-              <w:rPr>
-                <w:rFonts w:ascii="Times New Roman" w:hAnsi="Times New Roman" w:eastAsia="Times New Roman"/>
-                <w:b w:val="0"/>
-                <w:i w:val="0"/>
-                <w:color w:val="171B22"/>
-                <w:sz w:val="16"/>
-              </w:rPr>
-              <w:t>0.085</w:t>
-            </w:r>
-          </w:p>
-        </w:tc>
-        <w:tc>
-          <w:tcPr>
-            <w:tcW w:type="dxa" w:w="5783"/>
-            <w:tcBorders>
-              <w:top w:val="single" w:sz="4" w:color="C9BC9C"/>
-              <w:left w:val="single" w:sz="4" w:color="C9BC9C"/>
-              <w:bottom w:val="single" w:sz="4" w:color="C9BC9C"/>
-              <w:right w:val="single" w:sz="4" w:color="C9BC9C"/>
-            </w:tcBorders>
-          </w:tcPr>
-          <w:p>
-            <w:pPr>
-              <w:spacing w:before="20" w:after="20" w:line="240" w:lineRule="auto"/>
-              <w:jc w:val="center"/>
-            </w:pPr>
-            <w:r/>
-            <w:r>
-              <w:rPr>
-                <w:rFonts w:ascii="Times New Roman" w:hAnsi="Times New Roman" w:eastAsia="Times New Roman"/>
-                <w:b w:val="0"/>
-                <w:i w:val="0"/>
-                <w:color w:val="171B22"/>
-                <w:sz w:val="16"/>
-              </w:rPr>
-              <w:t>Co-hosts trend to score more (marginal)</w:t>
+              <w:t>Not significant once rank is in</w:t>
             </w:r>
           </w:p>
         </w:tc>
@@ -2412,7 +1952,7 @@
                 <w:color w:val="171B22"/>
                 <w:sz w:val="16"/>
               </w:rPr>
-              <w:t>−0.225</w:t>
+              <w:t>−0.207</w:t>
             </w:r>
           </w:p>
         </w:tc>
@@ -2441,7 +1981,7 @@
                 <w:color w:val="171B22"/>
                 <w:sz w:val="16"/>
               </w:rPr>
-              <w:t>0.073</w:t>
+              <w:t>0.102</w:t>
             </w:r>
           </w:p>
         </w:tc>
@@ -2470,7 +2010,7 @@
                 <w:color w:val="171B22"/>
                 <w:sz w:val="16"/>
               </w:rPr>
-              <w:t>Negative; likely a schedule confound, not “rest hurts”</w:t>
+              <w:t>Not significant</w:t>
             </w:r>
           </w:p>
         </w:tc>
@@ -2527,7 +2067,7 @@
                 <w:color w:val="171B22"/>
                 <w:sz w:val="16"/>
               </w:rPr>
-              <w:t>−0.287</w:t>
+              <w:t>−0.372</w:t>
             </w:r>
           </w:p>
         </w:tc>
@@ -2555,7 +2095,7 @@
                 <w:color w:val="171B22"/>
                 <w:sz w:val="16"/>
               </w:rPr>
-              <w:t>0.241</w:t>
+              <w:t>0.313</w:t>
             </w:r>
           </w:p>
         </w:tc>
@@ -2588,6 +2128,466 @@
           </w:p>
         </w:tc>
       </w:tr>
+      <w:tr>
+        <w:tc>
+          <w:tcPr>
+            <w:tcW w:type="dxa" w:w="1928"/>
+            <w:tcBorders>
+              <w:top w:val="single" w:sz="4" w:color="C9BC9C"/>
+              <w:left w:val="single" w:sz="4" w:color="C9BC9C"/>
+              <w:bottom w:val="single" w:sz="4" w:color="C9BC9C"/>
+              <w:right w:val="single" w:sz="4" w:color="C9BC9C"/>
+            </w:tcBorders>
+            <w:shd w:fill="F7F1E6" w:val="clear"/>
+          </w:tcPr>
+          <w:p>
+            <w:pPr>
+              <w:spacing w:before="20" w:after="20" w:line="240" w:lineRule="auto"/>
+            </w:pPr>
+            <w:r/>
+            <w:r>
+              <w:rPr>
+                <w:rFonts w:ascii="Times New Roman" w:hAnsi="Times New Roman" w:eastAsia="Times New Roman"/>
+                <w:b w:val="0"/>
+                <w:i w:val="0"/>
+                <w:color w:val="171B22"/>
+                <w:sz w:val="16"/>
+              </w:rPr>
+              <w:t>team_appearances</w:t>
+            </w:r>
+          </w:p>
+        </w:tc>
+        <w:tc>
+          <w:tcPr>
+            <w:tcW w:type="dxa" w:w="1134"/>
+            <w:tcBorders>
+              <w:top w:val="single" w:sz="4" w:color="C9BC9C"/>
+              <w:left w:val="single" w:sz="4" w:color="C9BC9C"/>
+              <w:bottom w:val="single" w:sz="4" w:color="C9BC9C"/>
+              <w:right w:val="single" w:sz="4" w:color="C9BC9C"/>
+            </w:tcBorders>
+            <w:shd w:fill="F7F1E6" w:val="clear"/>
+          </w:tcPr>
+          <w:p>
+            <w:pPr>
+              <w:spacing w:before="20" w:after="20" w:line="240" w:lineRule="auto"/>
+              <w:jc w:val="center"/>
+            </w:pPr>
+            <w:r/>
+            <w:r>
+              <w:rPr>
+                <w:rFonts w:ascii="Times New Roman" w:hAnsi="Times New Roman" w:eastAsia="Times New Roman"/>
+                <w:b w:val="0"/>
+                <w:i w:val="0"/>
+                <w:color w:val="171B22"/>
+                <w:sz w:val="16"/>
+              </w:rPr>
+              <w:t>+0.015</w:t>
+            </w:r>
+          </w:p>
+        </w:tc>
+        <w:tc>
+          <w:tcPr>
+            <w:tcW w:type="dxa" w:w="1247"/>
+            <w:tcBorders>
+              <w:top w:val="single" w:sz="4" w:color="C9BC9C"/>
+              <w:left w:val="single" w:sz="4" w:color="C9BC9C"/>
+              <w:bottom w:val="single" w:sz="4" w:color="C9BC9C"/>
+              <w:right w:val="single" w:sz="4" w:color="C9BC9C"/>
+            </w:tcBorders>
+            <w:shd w:fill="F7F1E6" w:val="clear"/>
+          </w:tcPr>
+          <w:p>
+            <w:pPr>
+              <w:spacing w:before="20" w:after="20" w:line="240" w:lineRule="auto"/>
+              <w:jc w:val="center"/>
+            </w:pPr>
+            <w:r/>
+            <w:r>
+              <w:rPr>
+                <w:rFonts w:ascii="Times New Roman" w:hAnsi="Times New Roman" w:eastAsia="Times New Roman"/>
+                <w:b w:val="0"/>
+                <w:i w:val="0"/>
+                <w:color w:val="171B22"/>
+                <w:sz w:val="16"/>
+              </w:rPr>
+              <w:t>0.558</w:t>
+            </w:r>
+          </w:p>
+        </w:tc>
+        <w:tc>
+          <w:tcPr>
+            <w:tcW w:type="dxa" w:w="5783"/>
+            <w:tcBorders>
+              <w:top w:val="single" w:sz="4" w:color="C9BC9C"/>
+              <w:left w:val="single" w:sz="4" w:color="C9BC9C"/>
+              <w:bottom w:val="single" w:sz="4" w:color="C9BC9C"/>
+              <w:right w:val="single" w:sz="4" w:color="C9BC9C"/>
+            </w:tcBorders>
+            <w:shd w:fill="F7F1E6" w:val="clear"/>
+          </w:tcPr>
+          <w:p>
+            <w:pPr>
+              <w:spacing w:before="20" w:after="20" w:line="240" w:lineRule="auto"/>
+              <w:jc w:val="center"/>
+            </w:pPr>
+            <w:r/>
+            <w:r>
+              <w:rPr>
+                <w:rFonts w:ascii="Times New Roman" w:hAnsi="Times New Roman" w:eastAsia="Times New Roman"/>
+                <w:b w:val="0"/>
+                <w:i w:val="0"/>
+                <w:color w:val="171B22"/>
+                <w:sz w:val="16"/>
+              </w:rPr>
+              <w:t>Own prior WC appearances not significant</w:t>
+            </w:r>
+          </w:p>
+        </w:tc>
+      </w:tr>
+      <w:tr>
+        <w:tc>
+          <w:tcPr>
+            <w:tcW w:type="dxa" w:w="1928"/>
+            <w:tcBorders>
+              <w:top w:val="single" w:sz="4" w:color="C9BC9C"/>
+              <w:left w:val="single" w:sz="4" w:color="C9BC9C"/>
+              <w:bottom w:val="single" w:sz="4" w:color="C9BC9C"/>
+              <w:right w:val="single" w:sz="4" w:color="C9BC9C"/>
+            </w:tcBorders>
+          </w:tcPr>
+          <w:p>
+            <w:pPr>
+              <w:spacing w:before="20" w:after="20" w:line="240" w:lineRule="auto"/>
+            </w:pPr>
+            <w:r/>
+            <w:r>
+              <w:rPr>
+                <w:rFonts w:ascii="Times New Roman" w:hAnsi="Times New Roman" w:eastAsia="Times New Roman"/>
+                <w:b w:val="0"/>
+                <w:i w:val="0"/>
+                <w:color w:val="171B22"/>
+                <w:sz w:val="16"/>
+              </w:rPr>
+              <w:t>opp_appearances *</w:t>
+            </w:r>
+          </w:p>
+        </w:tc>
+        <w:tc>
+          <w:tcPr>
+            <w:tcW w:type="dxa" w:w="1134"/>
+            <w:tcBorders>
+              <w:top w:val="single" w:sz="4" w:color="C9BC9C"/>
+              <w:left w:val="single" w:sz="4" w:color="C9BC9C"/>
+              <w:bottom w:val="single" w:sz="4" w:color="C9BC9C"/>
+              <w:right w:val="single" w:sz="4" w:color="C9BC9C"/>
+            </w:tcBorders>
+          </w:tcPr>
+          <w:p>
+            <w:pPr>
+              <w:spacing w:before="20" w:after="20" w:line="240" w:lineRule="auto"/>
+              <w:jc w:val="center"/>
+            </w:pPr>
+            <w:r/>
+            <w:r>
+              <w:rPr>
+                <w:rFonts w:ascii="Times New Roman" w:hAnsi="Times New Roman" w:eastAsia="Times New Roman"/>
+                <w:b w:val="0"/>
+                <w:i w:val="0"/>
+                <w:color w:val="171B22"/>
+                <w:sz w:val="16"/>
+              </w:rPr>
+              <w:t>−0.0645</w:t>
+            </w:r>
+          </w:p>
+        </w:tc>
+        <w:tc>
+          <w:tcPr>
+            <w:tcW w:type="dxa" w:w="1247"/>
+            <w:tcBorders>
+              <w:top w:val="single" w:sz="4" w:color="C9BC9C"/>
+              <w:left w:val="single" w:sz="4" w:color="C9BC9C"/>
+              <w:bottom w:val="single" w:sz="4" w:color="C9BC9C"/>
+              <w:right w:val="single" w:sz="4" w:color="C9BC9C"/>
+            </w:tcBorders>
+          </w:tcPr>
+          <w:p>
+            <w:pPr>
+              <w:spacing w:before="20" w:after="20" w:line="240" w:lineRule="auto"/>
+              <w:jc w:val="center"/>
+            </w:pPr>
+            <w:r/>
+            <w:r>
+              <w:rPr>
+                <w:rFonts w:ascii="Times New Roman" w:hAnsi="Times New Roman" w:eastAsia="Times New Roman"/>
+                <w:b w:val="0"/>
+                <w:i w:val="0"/>
+                <w:color w:val="171B22"/>
+                <w:sz w:val="16"/>
+              </w:rPr>
+              <w:t>0.000</w:t>
+            </w:r>
+          </w:p>
+        </w:tc>
+        <w:tc>
+          <w:tcPr>
+            <w:tcW w:type="dxa" w:w="5783"/>
+            <w:tcBorders>
+              <w:top w:val="single" w:sz="4" w:color="C9BC9C"/>
+              <w:left w:val="single" w:sz="4" w:color="C9BC9C"/>
+              <w:bottom w:val="single" w:sz="4" w:color="C9BC9C"/>
+              <w:right w:val="single" w:sz="4" w:color="C9BC9C"/>
+            </w:tcBorders>
+          </w:tcPr>
+          <w:p>
+            <w:pPr>
+              <w:spacing w:before="20" w:after="20" w:line="240" w:lineRule="auto"/>
+              <w:jc w:val="center"/>
+            </w:pPr>
+            <w:r/>
+            <w:r>
+              <w:rPr>
+                <w:rFonts w:ascii="Times New Roman" w:hAnsi="Times New Roman" w:eastAsia="Times New Roman"/>
+                <w:b w:val="0"/>
+                <w:i w:val="0"/>
+                <w:color w:val="171B22"/>
+                <w:sz w:val="16"/>
+              </w:rPr>
+              <w:t>More-experienced opponent → fewer goals</w:t>
+            </w:r>
+          </w:p>
+        </w:tc>
+      </w:tr>
+      <w:tr>
+        <w:tc>
+          <w:tcPr>
+            <w:tcW w:type="dxa" w:w="1928"/>
+            <w:tcBorders>
+              <w:top w:val="single" w:sz="4" w:color="C9BC9C"/>
+              <w:left w:val="single" w:sz="4" w:color="C9BC9C"/>
+              <w:bottom w:val="single" w:sz="4" w:color="C9BC9C"/>
+              <w:right w:val="single" w:sz="4" w:color="C9BC9C"/>
+            </w:tcBorders>
+            <w:shd w:fill="F7F1E6" w:val="clear"/>
+          </w:tcPr>
+          <w:p>
+            <w:pPr>
+              <w:spacing w:before="20" w:after="20" w:line="240" w:lineRule="auto"/>
+            </w:pPr>
+            <w:r/>
+            <w:r>
+              <w:rPr>
+                <w:rFonts w:ascii="Times New Roman" w:hAnsi="Times New Roman" w:eastAsia="Times New Roman"/>
+                <w:b w:val="0"/>
+                <w:i w:val="0"/>
+                <w:color w:val="171B22"/>
+                <w:sz w:val="16"/>
+              </w:rPr>
+              <w:t>is_uefa</w:t>
+            </w:r>
+          </w:p>
+        </w:tc>
+        <w:tc>
+          <w:tcPr>
+            <w:tcW w:type="dxa" w:w="1134"/>
+            <w:tcBorders>
+              <w:top w:val="single" w:sz="4" w:color="C9BC9C"/>
+              <w:left w:val="single" w:sz="4" w:color="C9BC9C"/>
+              <w:bottom w:val="single" w:sz="4" w:color="C9BC9C"/>
+              <w:right w:val="single" w:sz="4" w:color="C9BC9C"/>
+            </w:tcBorders>
+            <w:shd w:fill="F7F1E6" w:val="clear"/>
+          </w:tcPr>
+          <w:p>
+            <w:pPr>
+              <w:spacing w:before="20" w:after="20" w:line="240" w:lineRule="auto"/>
+              <w:jc w:val="center"/>
+            </w:pPr>
+            <w:r/>
+            <w:r>
+              <w:rPr>
+                <w:rFonts w:ascii="Times New Roman" w:hAnsi="Times New Roman" w:eastAsia="Times New Roman"/>
+                <w:b w:val="0"/>
+                <w:i w:val="0"/>
+                <w:color w:val="171B22"/>
+                <w:sz w:val="16"/>
+              </w:rPr>
+              <w:t>+0.303</w:t>
+            </w:r>
+          </w:p>
+        </w:tc>
+        <w:tc>
+          <w:tcPr>
+            <w:tcW w:type="dxa" w:w="1247"/>
+            <w:tcBorders>
+              <w:top w:val="single" w:sz="4" w:color="C9BC9C"/>
+              <w:left w:val="single" w:sz="4" w:color="C9BC9C"/>
+              <w:bottom w:val="single" w:sz="4" w:color="C9BC9C"/>
+              <w:right w:val="single" w:sz="4" w:color="C9BC9C"/>
+            </w:tcBorders>
+            <w:shd w:fill="F7F1E6" w:val="clear"/>
+          </w:tcPr>
+          <w:p>
+            <w:pPr>
+              <w:spacing w:before="20" w:after="20" w:line="240" w:lineRule="auto"/>
+              <w:jc w:val="center"/>
+            </w:pPr>
+            <w:r/>
+            <w:r>
+              <w:rPr>
+                <w:rFonts w:ascii="Times New Roman" w:hAnsi="Times New Roman" w:eastAsia="Times New Roman"/>
+                <w:b w:val="0"/>
+                <w:i w:val="0"/>
+                <w:color w:val="171B22"/>
+                <w:sz w:val="16"/>
+              </w:rPr>
+              <w:t>0.241</w:t>
+            </w:r>
+          </w:p>
+        </w:tc>
+        <w:tc>
+          <w:tcPr>
+            <w:tcW w:type="dxa" w:w="5783"/>
+            <w:tcBorders>
+              <w:top w:val="single" w:sz="4" w:color="C9BC9C"/>
+              <w:left w:val="single" w:sz="4" w:color="C9BC9C"/>
+              <w:bottom w:val="single" w:sz="4" w:color="C9BC9C"/>
+              <w:right w:val="single" w:sz="4" w:color="C9BC9C"/>
+            </w:tcBorders>
+            <w:shd w:fill="F7F1E6" w:val="clear"/>
+          </w:tcPr>
+          <w:p>
+            <w:pPr>
+              <w:spacing w:before="20" w:after="20" w:line="240" w:lineRule="auto"/>
+              <w:jc w:val="center"/>
+            </w:pPr>
+            <w:r/>
+            <w:r>
+              <w:rPr>
+                <w:rFonts w:ascii="Times New Roman" w:hAnsi="Times New Roman" w:eastAsia="Times New Roman"/>
+                <w:b w:val="0"/>
+                <w:i w:val="0"/>
+                <w:color w:val="171B22"/>
+                <w:sz w:val="16"/>
+              </w:rPr>
+              <w:t>Not significant</w:t>
+            </w:r>
+          </w:p>
+        </w:tc>
+      </w:tr>
+      <w:tr>
+        <w:tc>
+          <w:tcPr>
+            <w:tcW w:type="dxa" w:w="1928"/>
+            <w:tcBorders>
+              <w:top w:val="single" w:sz="4" w:color="C9BC9C"/>
+              <w:left w:val="single" w:sz="4" w:color="C9BC9C"/>
+              <w:bottom w:val="single" w:sz="4" w:color="C9BC9C"/>
+              <w:right w:val="single" w:sz="4" w:color="C9BC9C"/>
+            </w:tcBorders>
+          </w:tcPr>
+          <w:p>
+            <w:pPr>
+              <w:spacing w:before="20" w:after="20" w:line="240" w:lineRule="auto"/>
+            </w:pPr>
+            <w:r/>
+            <w:r>
+              <w:rPr>
+                <w:rFonts w:ascii="Times New Roman" w:hAnsi="Times New Roman" w:eastAsia="Times New Roman"/>
+                <w:b w:val="0"/>
+                <w:i w:val="0"/>
+                <w:color w:val="171B22"/>
+                <w:sz w:val="16"/>
+              </w:rPr>
+              <w:t>days_into_tournament</w:t>
+            </w:r>
+          </w:p>
+        </w:tc>
+        <w:tc>
+          <w:tcPr>
+            <w:tcW w:type="dxa" w:w="1134"/>
+            <w:tcBorders>
+              <w:top w:val="single" w:sz="4" w:color="C9BC9C"/>
+              <w:left w:val="single" w:sz="4" w:color="C9BC9C"/>
+              <w:bottom w:val="single" w:sz="4" w:color="C9BC9C"/>
+              <w:right w:val="single" w:sz="4" w:color="C9BC9C"/>
+            </w:tcBorders>
+          </w:tcPr>
+          <w:p>
+            <w:pPr>
+              <w:spacing w:before="20" w:after="20" w:line="240" w:lineRule="auto"/>
+              <w:jc w:val="center"/>
+            </w:pPr>
+            <w:r/>
+            <w:r>
+              <w:rPr>
+                <w:rFonts w:ascii="Times New Roman" w:hAnsi="Times New Roman" w:eastAsia="Times New Roman"/>
+                <w:b w:val="0"/>
+                <w:i w:val="0"/>
+                <w:color w:val="171B22"/>
+                <w:sz w:val="16"/>
+              </w:rPr>
+              <w:t>+0.008</w:t>
+            </w:r>
+          </w:p>
+        </w:tc>
+        <w:tc>
+          <w:tcPr>
+            <w:tcW w:type="dxa" w:w="1247"/>
+            <w:tcBorders>
+              <w:top w:val="single" w:sz="4" w:color="C9BC9C"/>
+              <w:left w:val="single" w:sz="4" w:color="C9BC9C"/>
+              <w:bottom w:val="single" w:sz="4" w:color="C9BC9C"/>
+              <w:right w:val="single" w:sz="4" w:color="C9BC9C"/>
+            </w:tcBorders>
+          </w:tcPr>
+          <w:p>
+            <w:pPr>
+              <w:spacing w:before="20" w:after="20" w:line="240" w:lineRule="auto"/>
+              <w:jc w:val="center"/>
+            </w:pPr>
+            <w:r/>
+            <w:r>
+              <w:rPr>
+                <w:rFonts w:ascii="Times New Roman" w:hAnsi="Times New Roman" w:eastAsia="Times New Roman"/>
+                <w:b w:val="0"/>
+                <w:i w:val="0"/>
+                <w:color w:val="171B22"/>
+                <w:sz w:val="16"/>
+              </w:rPr>
+              <w:t>0.668</w:t>
+            </w:r>
+          </w:p>
+        </w:tc>
+        <w:tc>
+          <w:tcPr>
+            <w:tcW w:type="dxa" w:w="5783"/>
+            <w:tcBorders>
+              <w:top w:val="single" w:sz="4" w:color="C9BC9C"/>
+              <w:left w:val="single" w:sz="4" w:color="C9BC9C"/>
+              <w:bottom w:val="single" w:sz="4" w:color="C9BC9C"/>
+              <w:right w:val="single" w:sz="4" w:color="C9BC9C"/>
+            </w:tcBorders>
+          </w:tcPr>
+          <w:p>
+            <w:pPr>
+              <w:spacing w:before="20" w:after="20" w:line="240" w:lineRule="auto"/>
+              <w:jc w:val="center"/>
+            </w:pPr>
+            <w:r/>
+            <w:r>
+              <w:rPr>
+                <w:rFonts w:ascii="Times New Roman" w:hAnsi="Times New Roman" w:eastAsia="Times New Roman"/>
+                <w:b w:val="0"/>
+                <w:i w:val="0"/>
+                <w:color w:val="171B22"/>
+                <w:sz w:val="16"/>
+              </w:rPr>
+              <w:t>Schedule day not significant</w:t>
+            </w:r>
+          </w:p>
+        </w:tc>
+      </w:tr>
     </w:tbl>
     <w:p>
       <w:pPr>
@@ -2607,7 +2607,7 @@
           <w:color w:val="171B22"/>
           <w:sz w:val="20"/>
         </w:rPr>
-        <w:t>The two significant drivers are opponent rank and own squad value. Own rank and host are close to the 5% line. Rest days is negative with p = 0.073; we do not claim that more rest reduces goals. First matches are filled at the median, and knockout scheduling sits in the same model, so this sign is more likely a timetable artefact.</w:t>
+        <w:t>Two coefficients are significant at 5%: own FIFA rank and the opponent’s prior World Cup appearances. A better-ranked team scores more. A more experienced opponent (more past tournaments) is associated with about 0.06 fewer goals per extra appearance. Squad value, UEFA membership and calendar day are not significant after those two are included.</w:t>
       </w:r>
     </w:p>
     <w:p>
@@ -2618,7 +2618,7 @@
       <w:r>
         <w:drawing>
           <wp:inline xmlns:a="http://schemas.openxmlformats.org/drawingml/2006/main" xmlns:pic="http://schemas.openxmlformats.org/drawingml/2006/picture">
-            <wp:extent cx="2880360" cy="2305167"/>
+            <wp:extent cx="2880360" cy="2884258"/>
             <wp:docPr id="1" name="Picture 1"/>
             <wp:cNvGraphicFramePr>
               <a:graphicFrameLocks noChangeAspect="1"/>
@@ -2639,7 +2639,7 @@
                   <pic:spPr>
                     <a:xfrm>
                       <a:off x="0" y="0"/>
-                      <a:ext cx="2880360" cy="2305167"/>
+                      <a:ext cx="2880360" cy="2884258"/>
                     </a:xfrm>
                     <a:prstGeom prst="rect"/>
                   </pic:spPr>
@@ -2662,7 +2662,7 @@
       <w:r>
         <w:drawing>
           <wp:inline xmlns:a="http://schemas.openxmlformats.org/drawingml/2006/main" xmlns:pic="http://schemas.openxmlformats.org/drawingml/2006/picture">
-            <wp:extent cx="2880360" cy="2305167"/>
+            <wp:extent cx="2880360" cy="2880360"/>
             <wp:docPr id="2" name="Picture 2"/>
             <wp:cNvGraphicFramePr>
               <a:graphicFrameLocks noChangeAspect="1"/>
@@ -2683,7 +2683,7 @@
                   <pic:spPr>
                     <a:xfrm>
                       <a:off x="0" y="0"/>
-                      <a:ext cx="2880360" cy="2305167"/>
+                      <a:ext cx="2880360" cy="2880360"/>
                     </a:xfrm>
                     <a:prstGeom prst="rect"/>
                   </pic:spPr>
@@ -2738,7 +2738,7 @@
           <w:color w:val="171B22"/>
           <w:sz w:val="20"/>
         </w:rPr>
-        <w:t>Multicollinearity was checked with variance inflation factors. The largest VIF excluding the intercept is 3.30 in Model 2.1 (value_diff) and 2.64 in Model 2.2. Both are well below the usual concern of 5 or 10, so the two significant variables in each model are not simply copies of each other. Shapiro–Wilk on training residuals: p = 0.937 for Model 2.1 (compatible with normality) and p = 0.034 for Model 2.2 (mild non-normality). That second result is not a surprise: goals are a small count (0, 1, 2, 3…). OLS was used because the brief asked for linear regression and because coefficients stay in “goals per unit of X” units. A Poisson or negative-binomial model would be a natural next step for Model 2.2.</w:t>
+        <w:t>Multicollinearity: largest VIF excluding the intercept is 3.30 in Model 2.1 and 3.44 in Model 2.2, both below 5. Shapiro–Wilk on training residuals: p = 0.937 for Model 2.1 (compatible with normality) and p = 0.017 for Model 2.2 (residuals not normal). Goals are a small count (0, 1, 2, 3…), so OLS is a blunt tool; the brief asked for linear regression, which is why we still use it. Poisson would be a natural next step for Model 2.2.</w:t>
       </w:r>
     </w:p>
     <w:p>
@@ -2785,7 +2785,7 @@
           <w:color w:val="171B22"/>
           <w:sz w:val="20"/>
         </w:rPr>
-        <w:t>Before kick-off, the information that actually moves predicted outcomes in this tournament is FIFA ranking and squad market value. In Model 2.1 those two gaps are the only 5% significant drivers of goal difference; a billion-euro value edge is associated with about 1.7 extra net goals after rank is held fixed. In Model 2.2 a team scores more when it is richer and when its opponent is weaker on the ranking list. Host status, rest, age and previous titles do not survive once rank and value are in the model. The goal-difference model fits better than the team-goals model, which matches the idea that a relative margin is more predictable than an absolute count. We would next refit Model 2.2 as Poisson regression with the same eight pre-match predictors and compare residual plots and out-of-sample error.</w:t>
+        <w:t>Before kick-off, FIFA ranking is the most consistent signal. In Model 2.1, rank_diff and value_diff are the only 5% significant drivers of goal difference; a billion-euro value edge is about +1.7 net goals after rank is held fixed. In Model 2.2, after we keep only four shared ideas, a team scores more when it is better ranked and scores less against opponents with more World Cup history. Test R² is much higher for goal difference (0.31) than for a single team’s tally (0.07). That gap is partly the harder target, and partly the four-variable sharing rule, which stops us putting opponent rank into both models. We would next try a Poisson model for 2.2, still with the same eight pre-match predictors.</w:t>
       </w:r>
     </w:p>
     <w:p>

</xml_diff>

<commit_message>
Rewrite Assessment 3 Word report to match the 4-page brief.
Single A4 10pt .docx covering Objective 2 only, with names/IDs table,
two OLS models, the four-shared-variable rule, and Python figures.

Co-authored-by: Bhupraj Tamang <BhuprajTmg@users.noreply.github.com>
</commit_message>
<xml_diff>
--- a/assessment3/HIT140_Assessment3_Group_Report.docx
+++ b/assessment3/HIT140_Assessment3_Group_Report.docx
@@ -2,6 +2,22 @@
 <file path=word/document.xml><?xml version="1.0" encoding="utf-8"?>
 <w:document xmlns:wpc="http://schemas.microsoft.com/office/word/2010/wordprocessingCanvas" xmlns:mo="http://schemas.microsoft.com/office/mac/office/2008/main" xmlns:mc="http://schemas.openxmlformats.org/markup-compatibility/2006" xmlns:mv="urn:schemas-microsoft-com:mac:vml" xmlns:o="urn:schemas-microsoft-com:office:office" xmlns:r="http://schemas.openxmlformats.org/officeDocument/2006/relationships" xmlns:m="http://schemas.openxmlformats.org/officeDocument/2006/math" xmlns:v="urn:schemas-microsoft-com:vml" xmlns:wp14="http://schemas.microsoft.com/office/word/2010/wordprocessingDrawing" xmlns:wp="http://schemas.openxmlformats.org/drawingml/2006/wordprocessingDrawing" xmlns:w10="urn:schemas-microsoft-com:office:word" xmlns:w="http://schemas.openxmlformats.org/wordprocessingml/2006/main" xmlns:w14="http://schemas.microsoft.com/office/word/2010/wordml" xmlns:wpg="http://schemas.microsoft.com/office/word/2010/wordprocessingGroup" xmlns:wpi="http://schemas.microsoft.com/office/word/2010/wordprocessingInk" xmlns:wne="http://schemas.microsoft.com/office/word/2006/wordml" xmlns:wps="http://schemas.microsoft.com/office/word/2010/wordprocessingShape" mc:Ignorable="w14 wp14">
   <w:body>
+    <w:p>
+      <w:pPr>
+        <w:spacing w:before="0" w:after="20" w:line="240" w:lineRule="auto"/>
+        <w:jc w:val="center"/>
+      </w:pPr>
+      <w:r>
+        <w:rPr>
+          <w:rFonts w:ascii="Times New Roman" w:hAnsi="Times New Roman" w:eastAsia="Times New Roman"/>
+          <w:b/>
+          <w:i w:val="0"/>
+          <w:color w:val="171B22"/>
+          <w:sz w:val="28"/>
+        </w:rPr>
+        <w:t>HIT140 Foundations of Data Science</w:t>
+      </w:r>
+    </w:p>
     <w:p>
       <w:pPr>
         <w:spacing w:before="0" w:after="40" w:line="240" w:lineRule="auto"/>
@@ -13,14 +29,14 @@
           <w:b/>
           <w:i w:val="0"/>
           <w:color w:val="171B22"/>
-          <w:sz w:val="28"/>
+          <w:sz w:val="24"/>
         </w:rPr>
-        <w:t>HIT140 Foundations of Data Science — Assessment 3</w:t>
+        <w:t>Assessment 3 — Group Project Report (Objective 2)</w:t>
       </w:r>
     </w:p>
     <w:p>
       <w:pPr>
-        <w:spacing w:before="0" w:after="80" w:line="240" w:lineRule="auto"/>
+        <w:spacing w:before="0" w:after="120" w:line="240" w:lineRule="auto"/>
         <w:jc w:val="center"/>
       </w:pPr>
       <w:r>
@@ -29,31 +45,333 @@
           <w:b w:val="0"/>
           <w:i/>
           <w:color w:val="171B22"/>
-          <w:sz w:val="22"/>
+          <w:sz w:val="20"/>
         </w:rPr>
-        <w:t>Objective 2: Predicting FIFA World Cup 2026 match outcomes from information known before kick-off</w:t>
+        <w:t>Two linear regression models of FIFA World Cup 2026 outcomes using only pre-match information</w:t>
       </w:r>
     </w:p>
     <w:p>
       <w:pPr>
         <w:spacing w:before="0" w:after="40" w:line="240" w:lineRule="auto"/>
-        <w:jc w:val="center"/>
+        <w:jc w:val="left"/>
       </w:pPr>
       <w:r>
         <w:rPr>
           <w:rFonts w:ascii="Times New Roman" w:hAnsi="Times New Roman" w:eastAsia="Times New Roman"/>
-          <w:b w:val="0"/>
+          <w:b/>
           <w:i w:val="0"/>
           <w:color w:val="171B22"/>
           <w:sz w:val="18"/>
         </w:rPr>
-        <w:t>Group members: Bhupraj Tamang (Student ID: ________)  ·  _______________ (ID: ________)  ·  _______________ (ID: ________)  ·  _______________ (ID: ________)</w:t>
+        <w:t>Group members (same group as Assessment 2)</w:t>
       </w:r>
+    </w:p>
+    <w:tbl>
+      <w:tblPr>
+        <w:tblW w:type="auto" w:w="0"/>
+        <w:jc w:val="center"/>
+        <w:tblLayout w:type="fixed"/>
+        <w:tblLook w:firstColumn="1" w:firstRow="1" w:lastColumn="0" w:lastRow="0" w:noHBand="0" w:noVBand="1" w:val="04A0"/>
+      </w:tblPr>
+      <w:tblGrid>
+        <w:gridCol w:w="4989"/>
+        <w:gridCol w:w="4989"/>
+      </w:tblGrid>
+      <w:tr>
+        <w:tc>
+          <w:tcPr>
+            <w:tcW w:type="dxa" w:w="5669"/>
+            <w:tcBorders>
+              <w:top w:val="single" w:sz="4" w:color="B0A48A"/>
+              <w:left w:val="single" w:sz="4" w:color="B0A48A"/>
+              <w:bottom w:val="single" w:sz="4" w:color="B0A48A"/>
+              <w:right w:val="single" w:sz="4" w:color="B0A48A"/>
+            </w:tcBorders>
+            <w:shd w:fill="EFE6D3" w:val="clear"/>
+          </w:tcPr>
+          <w:p>
+            <w:pPr>
+              <w:spacing w:before="20" w:after="20" w:line="240" w:lineRule="auto"/>
+              <w:jc w:val="center"/>
+            </w:pPr>
+            <w:r/>
+            <w:r>
+              <w:rPr>
+                <w:rFonts w:ascii="Times New Roman" w:hAnsi="Times New Roman" w:eastAsia="Times New Roman"/>
+                <w:b/>
+                <w:i w:val="0"/>
+                <w:color w:val="171B22"/>
+                <w:sz w:val="16"/>
+              </w:rPr>
+              <w:t>Name</w:t>
+            </w:r>
+          </w:p>
+        </w:tc>
+        <w:tc>
+          <w:tcPr>
+            <w:tcW w:type="dxa" w:w="4309"/>
+            <w:tcBorders>
+              <w:top w:val="single" w:sz="4" w:color="B0A48A"/>
+              <w:left w:val="single" w:sz="4" w:color="B0A48A"/>
+              <w:bottom w:val="single" w:sz="4" w:color="B0A48A"/>
+              <w:right w:val="single" w:sz="4" w:color="B0A48A"/>
+            </w:tcBorders>
+            <w:shd w:fill="EFE6D3" w:val="clear"/>
+          </w:tcPr>
+          <w:p>
+            <w:pPr>
+              <w:spacing w:before="20" w:after="20" w:line="240" w:lineRule="auto"/>
+              <w:jc w:val="center"/>
+            </w:pPr>
+            <w:r/>
+            <w:r>
+              <w:rPr>
+                <w:rFonts w:ascii="Times New Roman" w:hAnsi="Times New Roman" w:eastAsia="Times New Roman"/>
+                <w:b/>
+                <w:i w:val="0"/>
+                <w:color w:val="171B22"/>
+                <w:sz w:val="16"/>
+              </w:rPr>
+              <w:t>Student ID</w:t>
+            </w:r>
+          </w:p>
+        </w:tc>
+      </w:tr>
+      <w:tr>
+        <w:tc>
+          <w:tcPr>
+            <w:tcW w:type="dxa" w:w="5669"/>
+            <w:tcBorders>
+              <w:top w:val="single" w:sz="4" w:color="B0A48A"/>
+              <w:left w:val="single" w:sz="4" w:color="B0A48A"/>
+              <w:bottom w:val="single" w:sz="4" w:color="B0A48A"/>
+              <w:right w:val="single" w:sz="4" w:color="B0A48A"/>
+            </w:tcBorders>
+          </w:tcPr>
+          <w:p>
+            <w:pPr>
+              <w:spacing w:before="20" w:after="20" w:line="240" w:lineRule="auto"/>
+            </w:pPr>
+            <w:r/>
+            <w:r>
+              <w:rPr>
+                <w:rFonts w:ascii="Times New Roman" w:hAnsi="Times New Roman" w:eastAsia="Times New Roman"/>
+                <w:b w:val="0"/>
+                <w:i w:val="0"/>
+                <w:color w:val="171B22"/>
+                <w:sz w:val="16"/>
+              </w:rPr>
+              <w:t>Bhupraj Tamang</w:t>
+            </w:r>
+          </w:p>
+        </w:tc>
+        <w:tc>
+          <w:tcPr>
+            <w:tcW w:type="dxa" w:w="4309"/>
+            <w:tcBorders>
+              <w:top w:val="single" w:sz="4" w:color="B0A48A"/>
+              <w:left w:val="single" w:sz="4" w:color="B0A48A"/>
+              <w:bottom w:val="single" w:sz="4" w:color="B0A48A"/>
+              <w:right w:val="single" w:sz="4" w:color="B0A48A"/>
+            </w:tcBorders>
+          </w:tcPr>
+          <w:p>
+            <w:pPr>
+              <w:spacing w:before="20" w:after="20" w:line="240" w:lineRule="auto"/>
+              <w:jc w:val="center"/>
+            </w:pPr>
+            <w:r/>
+            <w:r>
+              <w:rPr>
+                <w:rFonts w:ascii="Times New Roman" w:hAnsi="Times New Roman" w:eastAsia="Times New Roman"/>
+                <w:b w:val="0"/>
+                <w:i w:val="0"/>
+                <w:color w:val="171B22"/>
+                <w:sz w:val="16"/>
+              </w:rPr>
+            </w:r>
+          </w:p>
+        </w:tc>
+      </w:tr>
+      <w:tr>
+        <w:tc>
+          <w:tcPr>
+            <w:tcW w:type="dxa" w:w="5669"/>
+            <w:tcBorders>
+              <w:top w:val="single" w:sz="4" w:color="B0A48A"/>
+              <w:left w:val="single" w:sz="4" w:color="B0A48A"/>
+              <w:bottom w:val="single" w:sz="4" w:color="B0A48A"/>
+              <w:right w:val="single" w:sz="4" w:color="B0A48A"/>
+            </w:tcBorders>
+            <w:shd w:fill="F7F1E6" w:val="clear"/>
+          </w:tcPr>
+          <w:p>
+            <w:pPr>
+              <w:spacing w:before="20" w:after="20" w:line="240" w:lineRule="auto"/>
+            </w:pPr>
+            <w:r/>
+            <w:r>
+              <w:rPr>
+                <w:rFonts w:ascii="Times New Roman" w:hAnsi="Times New Roman" w:eastAsia="Times New Roman"/>
+                <w:b w:val="0"/>
+                <w:i w:val="0"/>
+                <w:color w:val="171B22"/>
+                <w:sz w:val="16"/>
+              </w:rPr>
+            </w:r>
+          </w:p>
+        </w:tc>
+        <w:tc>
+          <w:tcPr>
+            <w:tcW w:type="dxa" w:w="4309"/>
+            <w:tcBorders>
+              <w:top w:val="single" w:sz="4" w:color="B0A48A"/>
+              <w:left w:val="single" w:sz="4" w:color="B0A48A"/>
+              <w:bottom w:val="single" w:sz="4" w:color="B0A48A"/>
+              <w:right w:val="single" w:sz="4" w:color="B0A48A"/>
+            </w:tcBorders>
+            <w:shd w:fill="F7F1E6" w:val="clear"/>
+          </w:tcPr>
+          <w:p>
+            <w:pPr>
+              <w:spacing w:before="20" w:after="20" w:line="240" w:lineRule="auto"/>
+              <w:jc w:val="center"/>
+            </w:pPr>
+            <w:r/>
+            <w:r>
+              <w:rPr>
+                <w:rFonts w:ascii="Times New Roman" w:hAnsi="Times New Roman" w:eastAsia="Times New Roman"/>
+                <w:b w:val="0"/>
+                <w:i w:val="0"/>
+                <w:color w:val="171B22"/>
+                <w:sz w:val="16"/>
+              </w:rPr>
+            </w:r>
+          </w:p>
+        </w:tc>
+      </w:tr>
+      <w:tr>
+        <w:tc>
+          <w:tcPr>
+            <w:tcW w:type="dxa" w:w="5669"/>
+            <w:tcBorders>
+              <w:top w:val="single" w:sz="4" w:color="B0A48A"/>
+              <w:left w:val="single" w:sz="4" w:color="B0A48A"/>
+              <w:bottom w:val="single" w:sz="4" w:color="B0A48A"/>
+              <w:right w:val="single" w:sz="4" w:color="B0A48A"/>
+            </w:tcBorders>
+          </w:tcPr>
+          <w:p>
+            <w:pPr>
+              <w:spacing w:before="20" w:after="20" w:line="240" w:lineRule="auto"/>
+            </w:pPr>
+            <w:r/>
+            <w:r>
+              <w:rPr>
+                <w:rFonts w:ascii="Times New Roman" w:hAnsi="Times New Roman" w:eastAsia="Times New Roman"/>
+                <w:b w:val="0"/>
+                <w:i w:val="0"/>
+                <w:color w:val="171B22"/>
+                <w:sz w:val="16"/>
+              </w:rPr>
+            </w:r>
+          </w:p>
+        </w:tc>
+        <w:tc>
+          <w:tcPr>
+            <w:tcW w:type="dxa" w:w="4309"/>
+            <w:tcBorders>
+              <w:top w:val="single" w:sz="4" w:color="B0A48A"/>
+              <w:left w:val="single" w:sz="4" w:color="B0A48A"/>
+              <w:bottom w:val="single" w:sz="4" w:color="B0A48A"/>
+              <w:right w:val="single" w:sz="4" w:color="B0A48A"/>
+            </w:tcBorders>
+          </w:tcPr>
+          <w:p>
+            <w:pPr>
+              <w:spacing w:before="20" w:after="20" w:line="240" w:lineRule="auto"/>
+              <w:jc w:val="center"/>
+            </w:pPr>
+            <w:r/>
+            <w:r>
+              <w:rPr>
+                <w:rFonts w:ascii="Times New Roman" w:hAnsi="Times New Roman" w:eastAsia="Times New Roman"/>
+                <w:b w:val="0"/>
+                <w:i w:val="0"/>
+                <w:color w:val="171B22"/>
+                <w:sz w:val="16"/>
+              </w:rPr>
+            </w:r>
+          </w:p>
+        </w:tc>
+      </w:tr>
+      <w:tr>
+        <w:tc>
+          <w:tcPr>
+            <w:tcW w:type="dxa" w:w="5669"/>
+            <w:tcBorders>
+              <w:top w:val="single" w:sz="4" w:color="B0A48A"/>
+              <w:left w:val="single" w:sz="4" w:color="B0A48A"/>
+              <w:bottom w:val="single" w:sz="4" w:color="B0A48A"/>
+              <w:right w:val="single" w:sz="4" w:color="B0A48A"/>
+            </w:tcBorders>
+            <w:shd w:fill="F7F1E6" w:val="clear"/>
+          </w:tcPr>
+          <w:p>
+            <w:pPr>
+              <w:spacing w:before="20" w:after="20" w:line="240" w:lineRule="auto"/>
+            </w:pPr>
+            <w:r/>
+            <w:r>
+              <w:rPr>
+                <w:rFonts w:ascii="Times New Roman" w:hAnsi="Times New Roman" w:eastAsia="Times New Roman"/>
+                <w:b w:val="0"/>
+                <w:i w:val="0"/>
+                <w:color w:val="171B22"/>
+                <w:sz w:val="16"/>
+              </w:rPr>
+            </w:r>
+          </w:p>
+        </w:tc>
+        <w:tc>
+          <w:tcPr>
+            <w:tcW w:type="dxa" w:w="4309"/>
+            <w:tcBorders>
+              <w:top w:val="single" w:sz="4" w:color="B0A48A"/>
+              <w:left w:val="single" w:sz="4" w:color="B0A48A"/>
+              <w:bottom w:val="single" w:sz="4" w:color="B0A48A"/>
+              <w:right w:val="single" w:sz="4" w:color="B0A48A"/>
+            </w:tcBorders>
+            <w:shd w:fill="F7F1E6" w:val="clear"/>
+          </w:tcPr>
+          <w:p>
+            <w:pPr>
+              <w:spacing w:before="20" w:after="20" w:line="240" w:lineRule="auto"/>
+              <w:jc w:val="center"/>
+            </w:pPr>
+            <w:r/>
+            <w:r>
+              <w:rPr>
+                <w:rFonts w:ascii="Times New Roman" w:hAnsi="Times New Roman" w:eastAsia="Times New Roman"/>
+                <w:b w:val="0"/>
+                <w:i w:val="0"/>
+                <w:color w:val="171B22"/>
+                <w:sz w:val="16"/>
+              </w:rPr>
+            </w:r>
+          </w:p>
+        </w:tc>
+      </w:tr>
+    </w:tbl>
+    <w:p>
+      <w:pPr>
+        <w:spacing w:after="40"/>
+      </w:pPr>
     </w:p>
     <w:p>
       <w:pPr>
-        <w:spacing w:before="0" w:after="160" w:line="240" w:lineRule="auto"/>
-        <w:jc w:val="center"/>
+        <w:spacing w:before="0" w:after="120" w:line="240" w:lineRule="auto"/>
+        <w:jc w:val="left"/>
       </w:pPr>
       <w:r>
         <w:rPr>
@@ -63,12 +381,12 @@
           <w:color w:val="171B22"/>
           <w:sz w:val="18"/>
         </w:rPr>
-        <w:t>Python code and dataset: https://github.com/BhuprajTmg/data-project   ·   Run: python wc2026_analytics.py</w:t>
+        <w:t>Python code and dataset: https://github.com/BhuprajTmg/data-project   ·   File to run: assignment3_final_code.py</w:t>
       </w:r>
     </w:p>
     <w:p>
       <w:pPr>
-        <w:spacing w:before="160" w:after="60" w:line="240" w:lineRule="auto"/>
+        <w:spacing w:before="140" w:after="40" w:line="240" w:lineRule="auto"/>
       </w:pPr>
       <w:r>
         <w:rPr>
@@ -78,7 +396,7 @@
           <w:color w:val="6E2129"/>
           <w:sz w:val="22"/>
         </w:rPr>
-        <w:t>1. Introduction and research questions</w:t>
+        <w:t>1. What we were asked to do</w:t>
       </w:r>
     </w:p>
     <w:p>
@@ -94,7 +412,7 @@
           <w:color w:val="171B22"/>
           <w:sz w:val="20"/>
         </w:rPr>
-        <w:t>This report covers Objective 2 of the HIT140 group project. We use real match, team and player data from the 2026 FIFA World Cup (Canada, Mexico and USA; 11 June–19 July 2026; 48 teams; 104 official matches; won 1–0 after extra time by Spain against Argentina). The aim is to predict match outcomes using only information that a team would know before the referee starts the game. We do not use shots, possession, cards in that match, or any other in-match event. Including those would leak the result we are trying to predict.</w:t>
+        <w:t>This report is Assessment 3. It answers Objective 2 of the project brief. We built two related but different linear regression models on the completed 2026 FIFA World Cup (Canada, Mexico and USA; 11 June to 19 July 2026; 48 teams; 104 official matches). Spain beat Argentina 1–0 after extra time in the final.</w:t>
       </w:r>
     </w:p>
     <w:p>
@@ -110,22 +428,7 @@
           <w:color w:val="171B22"/>
           <w:sz w:val="20"/>
         </w:rPr>
-        <w:t>We fit two ordinary least squares (OLS) linear regression models, each with exactly eight explanatory variables. The brief allows at most four of those variables to be shared. We share knockout, FIFA rank, squad value and rest days. Model 2.1 then uses age gap, title gap, host gap and same-confederation. Model 2.2 then uses prior World Cup appearances (own and opponent), a UEFA dummy, and days into the tournament from the published schedule. Model 2.1 predicts goal difference (104 rows). Model 2.2 predicts goals scored by one team (208 rows). Both use an 80/20 split (seed 42) and α = 0.05. All wrangling and charts are in assignment3_final_code.py. Excel only stores the raw sheets.</w:t>
-      </w:r>
-    </w:p>
-    <w:p>
-      <w:pPr>
-        <w:spacing w:before="160" w:after="60" w:line="240" w:lineRule="auto"/>
-      </w:pPr>
-      <w:r>
-        <w:rPr>
-          <w:rFonts w:ascii="Times New Roman" w:hAnsi="Times New Roman" w:eastAsia="Times New Roman"/>
-          <w:b/>
-          <w:i w:val="0"/>
-          <w:color w:val="6E2129"/>
-          <w:sz w:val="22"/>
-        </w:rPr>
-        <w:t>2. Data, cleaning and feature engineering</w:t>
+        <w:t>Linear Regression 2.1 predicts the goal difference of a match (team 1 goals minus team 2 goals). The dataset has 104 rows, one row per match, and exactly eight explanatory variables. Linear Regression 2.2 predicts how many goals one team scores in one match. That dataset has 208 rows, two rows per match, and another eight explanatory variables. The brief says at most four explanatory variables can be shared between the two models. Every predictor must be known before kick-off. We therefore did not use shots, possession, cards in that match, or any other in-match event.</w:t>
       </w:r>
     </w:p>
     <w:p>
@@ -141,7 +444,22 @@
           <w:color w:val="171B22"/>
           <w:sz w:val="20"/>
         </w:rPr>
-        <w:t>Three tables sit in fifa data.xlsx and are loaded by assignment3_final_code.py. matches (104 rows) has date, stage, teams, scores and attendance, compiled from the FIFA match centre, Wikipedia group and knockout pages, and worldcup.org.uk. teams (48 rows) has FIFA ranking at the 11 June 2026 freeze, confederation, host flag, previous World Cup titles and appearances, Transfermarkt squad value (EUR million) and squad average age. players (1,016 rows) is not used as a predictor here, but was used to check data quality: 294 player goals plus 14 own goals equal the official 308-goal tournament total, and 15 red cards match the official count.</w:t>
+        <w:t>All wrangling, modelling and charts were done in Python (pandas, statsmodels, scikit-learn, matplotlib). Excel was used only to store the raw tables in fifa data.xlsx. We used an 80/20 training/test split, random seed 42, and α = 0.05.</w:t>
+      </w:r>
+    </w:p>
+    <w:p>
+      <w:pPr>
+        <w:spacing w:before="140" w:after="40" w:line="240" w:lineRule="auto"/>
+      </w:pPr>
+      <w:r>
+        <w:rPr>
+          <w:rFonts w:ascii="Times New Roman" w:hAnsi="Times New Roman" w:eastAsia="Times New Roman"/>
+          <w:b/>
+          <w:i w:val="0"/>
+          <w:color w:val="6E2129"/>
+          <w:sz w:val="22"/>
+        </w:rPr>
+        <w:t>2. Data, cleaning and choice of variables</w:t>
       </w:r>
     </w:p>
     <w:p>
@@ -157,7 +475,7 @@
           <w:color w:val="171B22"/>
           <w:sz w:val="20"/>
         </w:rPr>
-        <w:t>Cleaning in Python: country names are mapped to one spelling (for example United States → USA, Turkey → Turkiye, Czech Republic → Czechia) so the three tables join with no unmatched teams. Dates are parsed. Numeric fields are coerced. Duplicate team rows are dropped. A knockout flag is 1 if the stage is Round of 32 through the Final (32 matches) and 0 for the group stage (72 matches). Rest days are the number of days since that team’s previous tournament match. A team’s first match has no previous date, so those 48 opening games are filled with the median rest observed in the rest of the tournament (5 days). That fill is known before kick-off and does not use the score.</w:t>
+        <w:t>We compiled three tables from public sources (FIFA match centre, Wikipedia, Transfermarkt, FIFA ranking of 11 June 2026). matches has 104 games. teams has 48 national sides (ranking, confederation, host, previous titles, previous World Cup appearances, squad value in EUR million, average age). players (1,016 players who featured) is not a predictor here; we used it only as a quality check (294 player goals + 14 own goals = 308 official goals; 15 red cards).</w:t>
       </w:r>
     </w:p>
     <w:p>
@@ -173,27 +491,12 @@
           <w:color w:val="171B22"/>
           <w:sz w:val="20"/>
         </w:rPr>
-        <w:t>Model 2.1 uses match-level differences (team 1 minus team 2): rank, value, rest and knockout (the four shared ideas), plus age, previous titles, host (−1, 0 or 1) and same confederation. A smaller FIFA rank number is a stronger team, so a negative rank_diff means team 1 is ranked better. Model 2.2 uses the team’s own rank, value, rest and knockout (the same four shared ideas), plus prior World Cup appearances for the team and the opponent, whether the team is UEFA, and days since 11 June 2026. That last variable comes from the published calendar, so it is known before kick-off. Age, titles, host and same-confederation are not reused in 2.2.</w:t>
+        <w:t>Cleaning is in assignment3_final_code.py. Country names are standardised so the tables join (for example United States → USA, Turkey → Turkiye). Dates and numbers are parsed. Duplicate team rows are dropped. knockout = 1 for Round of 32 through the Final (32 matches) and 0 for the group stage (72 matches). Rest days are days since that team’s last tournament match. A first match has no previous date, so we fill those with the median rest from the other matches (5 days). The fill uses the schedule, not the score.</w:t>
       </w:r>
     </w:p>
     <w:p>
       <w:pPr>
-        <w:spacing w:before="160" w:after="60" w:line="240" w:lineRule="auto"/>
-      </w:pPr>
-      <w:r>
-        <w:rPr>
-          <w:rFonts w:ascii="Times New Roman" w:hAnsi="Times New Roman" w:eastAsia="Times New Roman"/>
-          <w:b/>
-          <w:i w:val="0"/>
-          <w:color w:val="6E2129"/>
-          <w:sz w:val="22"/>
-        </w:rPr>
-        <w:t>3. Model 2.1 — match goal difference (n = 104)</w:t>
-      </w:r>
-    </w:p>
-    <w:p>
-      <w:pPr>
-        <w:spacing w:before="0" w:after="80" w:line="240" w:lineRule="auto"/>
+        <w:spacing w:before="0" w:after="100" w:line="240" w:lineRule="auto"/>
         <w:jc w:val="both"/>
       </w:pPr>
       <w:r>
@@ -204,7 +507,38 @@
           <w:color w:val="171B22"/>
           <w:sz w:val="20"/>
         </w:rPr>
-        <w:t>Target: goal_diff = team1_goals − team2_goals. Training set 83 matches, test set 21 matches. Training R² = 0.493 (adjusted R² = 0.438). On the held-out matches, test R² = 0.306, RMSE = 1.57 goals and MAE = 1.18 goals. About half of the variation in goal difference is described in-sample; out of sample the fit is weaker, which is expected with only 21 test matches, but the model still predicts better than a mean-only baseline.</w:t>
+        <w:t>Shared variables (4): knockout, FIFA rank, squad market value, and rest days. Unique to 2.1 (4): age_diff, titles_diff, host_diff, same_confed. Unique to 2.2 (4): team_appearances, opp_appearances, is_uefa, days_into_tournament (days since 11 June, from the published calendar). Model 2.1 stores rank, value and rest as team-1-minus-team-2 differences. Model 2.2 stores them as the team’s own rank, value and rest. A smaller rank number means a stronger team.</w:t>
+      </w:r>
+    </w:p>
+    <w:p>
+      <w:pPr>
+        <w:spacing w:before="140" w:after="40" w:line="240" w:lineRule="auto"/>
+      </w:pPr>
+      <w:r>
+        <w:rPr>
+          <w:rFonts w:ascii="Times New Roman" w:hAnsi="Times New Roman" w:eastAsia="Times New Roman"/>
+          <w:b/>
+          <w:i w:val="0"/>
+          <w:color w:val="6E2129"/>
+          <w:sz w:val="22"/>
+        </w:rPr>
+        <w:t>3. Linear Regression 2.1 — goal difference (104 matches)</w:t>
+      </w:r>
+    </w:p>
+    <w:p>
+      <w:pPr>
+        <w:spacing w:before="0" w:after="100" w:line="240" w:lineRule="auto"/>
+        <w:jc w:val="both"/>
+      </w:pPr>
+      <w:r>
+        <w:rPr>
+          <w:rFonts w:ascii="Times New Roman" w:hAnsi="Times New Roman" w:eastAsia="Times New Roman"/>
+          <w:b w:val="0"/>
+          <w:i w:val="0"/>
+          <w:color w:val="171B22"/>
+          <w:sz w:val="20"/>
+        </w:rPr>
+        <w:t>Target: goal_diff. Training n = 83, test n = 21. Training R² = 0.493 (adjusted R² = 0.438). Test R² = 0.306, RMSE = 1.57 goals, MAE = 1.18 goals. The model explains about half of the training variation. Test fit is lower, which is normal with 21 held-out matches, but it is still better than guessing the mean.</w:t>
       </w:r>
     </w:p>
     <w:tbl>
@@ -215,20 +549,20 @@
         <w:tblLook w:firstColumn="1" w:firstRow="1" w:lastColumn="0" w:lastRow="0" w:noHBand="0" w:noVBand="1" w:val="04A0"/>
       </w:tblPr>
       <w:tblGrid>
-        <w:gridCol w:w="2523"/>
-        <w:gridCol w:w="2523"/>
-        <w:gridCol w:w="2523"/>
-        <w:gridCol w:w="2523"/>
+        <w:gridCol w:w="2494"/>
+        <w:gridCol w:w="2494"/>
+        <w:gridCol w:w="2494"/>
+        <w:gridCol w:w="2494"/>
       </w:tblGrid>
       <w:tr>
         <w:tc>
           <w:tcPr>
-            <w:tcW w:type="dxa" w:w="1928"/>
+            <w:tcW w:type="dxa" w:w="1984"/>
             <w:tcBorders>
-              <w:top w:val="single" w:sz="4" w:color="C9BC9C"/>
-              <w:left w:val="single" w:sz="4" w:color="C9BC9C"/>
-              <w:bottom w:val="single" w:sz="4" w:color="C9BC9C"/>
-              <w:right w:val="single" w:sz="4" w:color="C9BC9C"/>
+              <w:top w:val="single" w:sz="4" w:color="B0A48A"/>
+              <w:left w:val="single" w:sz="4" w:color="B0A48A"/>
+              <w:bottom w:val="single" w:sz="4" w:color="B0A48A"/>
+              <w:right w:val="single" w:sz="4" w:color="B0A48A"/>
             </w:tcBorders>
             <w:shd w:fill="EFE6D3" w:val="clear"/>
           </w:tcPr>
@@ -252,12 +586,12 @@
         </w:tc>
         <w:tc>
           <w:tcPr>
-            <w:tcW w:type="dxa" w:w="1134"/>
+            <w:tcW w:type="dxa" w:w="1191"/>
             <w:tcBorders>
-              <w:top w:val="single" w:sz="4" w:color="C9BC9C"/>
-              <w:left w:val="single" w:sz="4" w:color="C9BC9C"/>
-              <w:bottom w:val="single" w:sz="4" w:color="C9BC9C"/>
-              <w:right w:val="single" w:sz="4" w:color="C9BC9C"/>
+              <w:top w:val="single" w:sz="4" w:color="B0A48A"/>
+              <w:left w:val="single" w:sz="4" w:color="B0A48A"/>
+              <w:bottom w:val="single" w:sz="4" w:color="B0A48A"/>
+              <w:right w:val="single" w:sz="4" w:color="B0A48A"/>
             </w:tcBorders>
             <w:shd w:fill="EFE6D3" w:val="clear"/>
           </w:tcPr>
@@ -283,10 +617,10 @@
           <w:tcPr>
             <w:tcW w:type="dxa" w:w="1247"/>
             <w:tcBorders>
-              <w:top w:val="single" w:sz="4" w:color="C9BC9C"/>
-              <w:left w:val="single" w:sz="4" w:color="C9BC9C"/>
-              <w:bottom w:val="single" w:sz="4" w:color="C9BC9C"/>
-              <w:right w:val="single" w:sz="4" w:color="C9BC9C"/>
+              <w:top w:val="single" w:sz="4" w:color="B0A48A"/>
+              <w:left w:val="single" w:sz="4" w:color="B0A48A"/>
+              <w:bottom w:val="single" w:sz="4" w:color="B0A48A"/>
+              <w:right w:val="single" w:sz="4" w:color="B0A48A"/>
             </w:tcBorders>
             <w:shd w:fill="EFE6D3" w:val="clear"/>
           </w:tcPr>
@@ -310,12 +644,12 @@
         </w:tc>
         <w:tc>
           <w:tcPr>
-            <w:tcW w:type="dxa" w:w="5783"/>
+            <w:tcW w:type="dxa" w:w="5556"/>
             <w:tcBorders>
-              <w:top w:val="single" w:sz="4" w:color="C9BC9C"/>
-              <w:left w:val="single" w:sz="4" w:color="C9BC9C"/>
-              <w:bottom w:val="single" w:sz="4" w:color="C9BC9C"/>
-              <w:right w:val="single" w:sz="4" w:color="C9BC9C"/>
+              <w:top w:val="single" w:sz="4" w:color="B0A48A"/>
+              <w:left w:val="single" w:sz="4" w:color="B0A48A"/>
+              <w:bottom w:val="single" w:sz="4" w:color="B0A48A"/>
+              <w:right w:val="single" w:sz="4" w:color="B0A48A"/>
             </w:tcBorders>
             <w:shd w:fill="EFE6D3" w:val="clear"/>
           </w:tcPr>
@@ -333,7 +667,7 @@
                 <w:color w:val="171B22"/>
                 <w:sz w:val="16"/>
               </w:rPr>
-              <w:t>Reading in plain English</w:t>
+              <w:t>Meaning</w:t>
             </w:r>
           </w:p>
         </w:tc>
@@ -341,12 +675,12 @@
       <w:tr>
         <w:tc>
           <w:tcPr>
-            <w:tcW w:type="dxa" w:w="1928"/>
+            <w:tcW w:type="dxa" w:w="1984"/>
             <w:tcBorders>
-              <w:top w:val="single" w:sz="4" w:color="C9BC9C"/>
-              <w:left w:val="single" w:sz="4" w:color="C9BC9C"/>
-              <w:bottom w:val="single" w:sz="4" w:color="C9BC9C"/>
-              <w:right w:val="single" w:sz="4" w:color="C9BC9C"/>
+              <w:top w:val="single" w:sz="4" w:color="B0A48A"/>
+              <w:left w:val="single" w:sz="4" w:color="B0A48A"/>
+              <w:bottom w:val="single" w:sz="4" w:color="B0A48A"/>
+              <w:right w:val="single" w:sz="4" w:color="B0A48A"/>
             </w:tcBorders>
           </w:tcPr>
           <w:p>
@@ -368,12 +702,12 @@
         </w:tc>
         <w:tc>
           <w:tcPr>
-            <w:tcW w:type="dxa" w:w="1134"/>
+            <w:tcW w:type="dxa" w:w="1191"/>
             <w:tcBorders>
-              <w:top w:val="single" w:sz="4" w:color="C9BC9C"/>
-              <w:left w:val="single" w:sz="4" w:color="C9BC9C"/>
-              <w:bottom w:val="single" w:sz="4" w:color="C9BC9C"/>
-              <w:right w:val="single" w:sz="4" w:color="C9BC9C"/>
+              <w:top w:val="single" w:sz="4" w:color="B0A48A"/>
+              <w:left w:val="single" w:sz="4" w:color="B0A48A"/>
+              <w:bottom w:val="single" w:sz="4" w:color="B0A48A"/>
+              <w:right w:val="single" w:sz="4" w:color="B0A48A"/>
             </w:tcBorders>
           </w:tcPr>
           <w:p>
@@ -398,10 +732,10 @@
           <w:tcPr>
             <w:tcW w:type="dxa" w:w="1247"/>
             <w:tcBorders>
-              <w:top w:val="single" w:sz="4" w:color="C9BC9C"/>
-              <w:left w:val="single" w:sz="4" w:color="C9BC9C"/>
-              <w:bottom w:val="single" w:sz="4" w:color="C9BC9C"/>
-              <w:right w:val="single" w:sz="4" w:color="C9BC9C"/>
+              <w:top w:val="single" w:sz="4" w:color="B0A48A"/>
+              <w:left w:val="single" w:sz="4" w:color="B0A48A"/>
+              <w:bottom w:val="single" w:sz="4" w:color="B0A48A"/>
+              <w:right w:val="single" w:sz="4" w:color="B0A48A"/>
             </w:tcBorders>
           </w:tcPr>
           <w:p>
@@ -424,12 +758,12 @@
         </w:tc>
         <w:tc>
           <w:tcPr>
-            <w:tcW w:type="dxa" w:w="5783"/>
+            <w:tcW w:type="dxa" w:w="5556"/>
             <w:tcBorders>
-              <w:top w:val="single" w:sz="4" w:color="C9BC9C"/>
-              <w:left w:val="single" w:sz="4" w:color="C9BC9C"/>
-              <w:bottom w:val="single" w:sz="4" w:color="C9BC9C"/>
-              <w:right w:val="single" w:sz="4" w:color="C9BC9C"/>
+              <w:top w:val="single" w:sz="4" w:color="B0A48A"/>
+              <w:left w:val="single" w:sz="4" w:color="B0A48A"/>
+              <w:bottom w:val="single" w:sz="4" w:color="B0A48A"/>
+              <w:right w:val="single" w:sz="4" w:color="B0A48A"/>
             </w:tcBorders>
           </w:tcPr>
           <w:p>
@@ -454,12 +788,12 @@
       <w:tr>
         <w:tc>
           <w:tcPr>
-            <w:tcW w:type="dxa" w:w="1928"/>
+            <w:tcW w:type="dxa" w:w="1984"/>
             <w:tcBorders>
-              <w:top w:val="single" w:sz="4" w:color="C9BC9C"/>
-              <w:left w:val="single" w:sz="4" w:color="C9BC9C"/>
-              <w:bottom w:val="single" w:sz="4" w:color="C9BC9C"/>
-              <w:right w:val="single" w:sz="4" w:color="C9BC9C"/>
+              <w:top w:val="single" w:sz="4" w:color="B0A48A"/>
+              <w:left w:val="single" w:sz="4" w:color="B0A48A"/>
+              <w:bottom w:val="single" w:sz="4" w:color="B0A48A"/>
+              <w:right w:val="single" w:sz="4" w:color="B0A48A"/>
             </w:tcBorders>
             <w:shd w:fill="F7F1E6" w:val="clear"/>
           </w:tcPr>
@@ -482,12 +816,12 @@
         </w:tc>
         <w:tc>
           <w:tcPr>
-            <w:tcW w:type="dxa" w:w="1134"/>
+            <w:tcW w:type="dxa" w:w="1191"/>
             <w:tcBorders>
-              <w:top w:val="single" w:sz="4" w:color="C9BC9C"/>
-              <w:left w:val="single" w:sz="4" w:color="C9BC9C"/>
-              <w:bottom w:val="single" w:sz="4" w:color="C9BC9C"/>
-              <w:right w:val="single" w:sz="4" w:color="C9BC9C"/>
+              <w:top w:val="single" w:sz="4" w:color="B0A48A"/>
+              <w:left w:val="single" w:sz="4" w:color="B0A48A"/>
+              <w:bottom w:val="single" w:sz="4" w:color="B0A48A"/>
+              <w:right w:val="single" w:sz="4" w:color="B0A48A"/>
             </w:tcBorders>
             <w:shd w:fill="F7F1E6" w:val="clear"/>
           </w:tcPr>
@@ -513,10 +847,10 @@
           <w:tcPr>
             <w:tcW w:type="dxa" w:w="1247"/>
             <w:tcBorders>
-              <w:top w:val="single" w:sz="4" w:color="C9BC9C"/>
-              <w:left w:val="single" w:sz="4" w:color="C9BC9C"/>
-              <w:bottom w:val="single" w:sz="4" w:color="C9BC9C"/>
-              <w:right w:val="single" w:sz="4" w:color="C9BC9C"/>
+              <w:top w:val="single" w:sz="4" w:color="B0A48A"/>
+              <w:left w:val="single" w:sz="4" w:color="B0A48A"/>
+              <w:bottom w:val="single" w:sz="4" w:color="B0A48A"/>
+              <w:right w:val="single" w:sz="4" w:color="B0A48A"/>
             </w:tcBorders>
             <w:shd w:fill="F7F1E6" w:val="clear"/>
           </w:tcPr>
@@ -540,12 +874,12 @@
         </w:tc>
         <w:tc>
           <w:tcPr>
-            <w:tcW w:type="dxa" w:w="5783"/>
+            <w:tcW w:type="dxa" w:w="5556"/>
             <w:tcBorders>
-              <w:top w:val="single" w:sz="4" w:color="C9BC9C"/>
-              <w:left w:val="single" w:sz="4" w:color="C9BC9C"/>
-              <w:bottom w:val="single" w:sz="4" w:color="C9BC9C"/>
-              <w:right w:val="single" w:sz="4" w:color="C9BC9C"/>
+              <w:top w:val="single" w:sz="4" w:color="B0A48A"/>
+              <w:left w:val="single" w:sz="4" w:color="B0A48A"/>
+              <w:bottom w:val="single" w:sz="4" w:color="B0A48A"/>
+              <w:right w:val="single" w:sz="4" w:color="B0A48A"/>
             </w:tcBorders>
             <w:shd w:fill="F7F1E6" w:val="clear"/>
           </w:tcPr>
@@ -563,7 +897,7 @@
                 <w:color w:val="171B22"/>
                 <w:sz w:val="16"/>
               </w:rPr>
-              <w:t>Better FIFA rank (smaller number) for team 1 → more net goals</w:t>
+              <w:t>Better rank for team 1 (smaller number) → more net goals</w:t>
             </w:r>
           </w:p>
         </w:tc>
@@ -571,13 +905,357 @@
       <w:tr>
         <w:tc>
           <w:tcPr>
-            <w:tcW w:type="dxa" w:w="1928"/>
+            <w:tcW w:type="dxa" w:w="1984"/>
             <w:tcBorders>
-              <w:top w:val="single" w:sz="4" w:color="C9BC9C"/>
-              <w:left w:val="single" w:sz="4" w:color="C9BC9C"/>
-              <w:bottom w:val="single" w:sz="4" w:color="C9BC9C"/>
-              <w:right w:val="single" w:sz="4" w:color="C9BC9C"/>
+              <w:top w:val="single" w:sz="4" w:color="B0A48A"/>
+              <w:left w:val="single" w:sz="4" w:color="B0A48A"/>
+              <w:bottom w:val="single" w:sz="4" w:color="B0A48A"/>
+              <w:right w:val="single" w:sz="4" w:color="B0A48A"/>
             </w:tcBorders>
+          </w:tcPr>
+          <w:p>
+            <w:pPr>
+              <w:spacing w:before="20" w:after="20" w:line="240" w:lineRule="auto"/>
+            </w:pPr>
+            <w:r/>
+            <w:r>
+              <w:rPr>
+                <w:rFonts w:ascii="Times New Roman" w:hAnsi="Times New Roman" w:eastAsia="Times New Roman"/>
+                <w:b w:val="0"/>
+                <w:i w:val="0"/>
+                <w:color w:val="171B22"/>
+                <w:sz w:val="16"/>
+              </w:rPr>
+              <w:t>value_diff *</w:t>
+            </w:r>
+          </w:p>
+        </w:tc>
+        <w:tc>
+          <w:tcPr>
+            <w:tcW w:type="dxa" w:w="1191"/>
+            <w:tcBorders>
+              <w:top w:val="single" w:sz="4" w:color="B0A48A"/>
+              <w:left w:val="single" w:sz="4" w:color="B0A48A"/>
+              <w:bottom w:val="single" w:sz="4" w:color="B0A48A"/>
+              <w:right w:val="single" w:sz="4" w:color="B0A48A"/>
+            </w:tcBorders>
+          </w:tcPr>
+          <w:p>
+            <w:pPr>
+              <w:spacing w:before="20" w:after="20" w:line="240" w:lineRule="auto"/>
+              <w:jc w:val="center"/>
+            </w:pPr>
+            <w:r/>
+            <w:r>
+              <w:rPr>
+                <w:rFonts w:ascii="Times New Roman" w:hAnsi="Times New Roman" w:eastAsia="Times New Roman"/>
+                <w:b w:val="0"/>
+                <w:i w:val="0"/>
+                <w:color w:val="171B22"/>
+                <w:sz w:val="16"/>
+              </w:rPr>
+              <w:t>+0.0017</w:t>
+            </w:r>
+          </w:p>
+        </w:tc>
+        <w:tc>
+          <w:tcPr>
+            <w:tcW w:type="dxa" w:w="1247"/>
+            <w:tcBorders>
+              <w:top w:val="single" w:sz="4" w:color="B0A48A"/>
+              <w:left w:val="single" w:sz="4" w:color="B0A48A"/>
+              <w:bottom w:val="single" w:sz="4" w:color="B0A48A"/>
+              <w:right w:val="single" w:sz="4" w:color="B0A48A"/>
+            </w:tcBorders>
+          </w:tcPr>
+          <w:p>
+            <w:pPr>
+              <w:spacing w:before="20" w:after="20" w:line="240" w:lineRule="auto"/>
+              <w:jc w:val="center"/>
+            </w:pPr>
+            <w:r/>
+            <w:r>
+              <w:rPr>
+                <w:rFonts w:ascii="Times New Roman" w:hAnsi="Times New Roman" w:eastAsia="Times New Roman"/>
+                <w:b w:val="0"/>
+                <w:i w:val="0"/>
+                <w:color w:val="171B22"/>
+                <w:sz w:val="16"/>
+              </w:rPr>
+              <w:t>0.004</w:t>
+            </w:r>
+          </w:p>
+        </w:tc>
+        <w:tc>
+          <w:tcPr>
+            <w:tcW w:type="dxa" w:w="5556"/>
+            <w:tcBorders>
+              <w:top w:val="single" w:sz="4" w:color="B0A48A"/>
+              <w:left w:val="single" w:sz="4" w:color="B0A48A"/>
+              <w:bottom w:val="single" w:sz="4" w:color="B0A48A"/>
+              <w:right w:val="single" w:sz="4" w:color="B0A48A"/>
+            </w:tcBorders>
+          </w:tcPr>
+          <w:p>
+            <w:pPr>
+              <w:spacing w:before="20" w:after="20" w:line="240" w:lineRule="auto"/>
+              <w:jc w:val="center"/>
+            </w:pPr>
+            <w:r/>
+            <w:r>
+              <w:rPr>
+                <w:rFonts w:ascii="Times New Roman" w:hAnsi="Times New Roman" w:eastAsia="Times New Roman"/>
+                <w:b w:val="0"/>
+                <w:i w:val="0"/>
+                <w:color w:val="171B22"/>
+                <w:sz w:val="16"/>
+              </w:rPr>
+              <w:t>EUR 1bn extra squad value ≈ +1.7 net goals</w:t>
+            </w:r>
+          </w:p>
+        </w:tc>
+      </w:tr>
+      <w:tr>
+        <w:tc>
+          <w:tcPr>
+            <w:tcW w:type="dxa" w:w="1984"/>
+            <w:tcBorders>
+              <w:top w:val="single" w:sz="4" w:color="B0A48A"/>
+              <w:left w:val="single" w:sz="4" w:color="B0A48A"/>
+              <w:bottom w:val="single" w:sz="4" w:color="B0A48A"/>
+              <w:right w:val="single" w:sz="4" w:color="B0A48A"/>
+            </w:tcBorders>
+            <w:shd w:fill="F7F1E6" w:val="clear"/>
+          </w:tcPr>
+          <w:p>
+            <w:pPr>
+              <w:spacing w:before="20" w:after="20" w:line="240" w:lineRule="auto"/>
+            </w:pPr>
+            <w:r/>
+            <w:r>
+              <w:rPr>
+                <w:rFonts w:ascii="Times New Roman" w:hAnsi="Times New Roman" w:eastAsia="Times New Roman"/>
+                <w:b w:val="0"/>
+                <w:i w:val="0"/>
+                <w:color w:val="171B22"/>
+                <w:sz w:val="16"/>
+              </w:rPr>
+              <w:t>rest_diff</w:t>
+            </w:r>
+          </w:p>
+        </w:tc>
+        <w:tc>
+          <w:tcPr>
+            <w:tcW w:type="dxa" w:w="1191"/>
+            <w:tcBorders>
+              <w:top w:val="single" w:sz="4" w:color="B0A48A"/>
+              <w:left w:val="single" w:sz="4" w:color="B0A48A"/>
+              <w:bottom w:val="single" w:sz="4" w:color="B0A48A"/>
+              <w:right w:val="single" w:sz="4" w:color="B0A48A"/>
+            </w:tcBorders>
+            <w:shd w:fill="F7F1E6" w:val="clear"/>
+          </w:tcPr>
+          <w:p>
+            <w:pPr>
+              <w:spacing w:before="20" w:after="20" w:line="240" w:lineRule="auto"/>
+              <w:jc w:val="center"/>
+            </w:pPr>
+            <w:r/>
+            <w:r>
+              <w:rPr>
+                <w:rFonts w:ascii="Times New Roman" w:hAnsi="Times New Roman" w:eastAsia="Times New Roman"/>
+                <w:b w:val="0"/>
+                <w:i w:val="0"/>
+                <w:color w:val="171B22"/>
+                <w:sz w:val="16"/>
+              </w:rPr>
+              <w:t>+0.172</w:t>
+            </w:r>
+          </w:p>
+        </w:tc>
+        <w:tc>
+          <w:tcPr>
+            <w:tcW w:type="dxa" w:w="1247"/>
+            <w:tcBorders>
+              <w:top w:val="single" w:sz="4" w:color="B0A48A"/>
+              <w:left w:val="single" w:sz="4" w:color="B0A48A"/>
+              <w:bottom w:val="single" w:sz="4" w:color="B0A48A"/>
+              <w:right w:val="single" w:sz="4" w:color="B0A48A"/>
+            </w:tcBorders>
+            <w:shd w:fill="F7F1E6" w:val="clear"/>
+          </w:tcPr>
+          <w:p>
+            <w:pPr>
+              <w:spacing w:before="20" w:after="20" w:line="240" w:lineRule="auto"/>
+              <w:jc w:val="center"/>
+            </w:pPr>
+            <w:r/>
+            <w:r>
+              <w:rPr>
+                <w:rFonts w:ascii="Times New Roman" w:hAnsi="Times New Roman" w:eastAsia="Times New Roman"/>
+                <w:b w:val="0"/>
+                <w:i w:val="0"/>
+                <w:color w:val="171B22"/>
+                <w:sz w:val="16"/>
+              </w:rPr>
+              <w:t>0.641</w:t>
+            </w:r>
+          </w:p>
+        </w:tc>
+        <w:tc>
+          <w:tcPr>
+            <w:tcW w:type="dxa" w:w="5556"/>
+            <w:tcBorders>
+              <w:top w:val="single" w:sz="4" w:color="B0A48A"/>
+              <w:left w:val="single" w:sz="4" w:color="B0A48A"/>
+              <w:bottom w:val="single" w:sz="4" w:color="B0A48A"/>
+              <w:right w:val="single" w:sz="4" w:color="B0A48A"/>
+            </w:tcBorders>
+            <w:shd w:fill="F7F1E6" w:val="clear"/>
+          </w:tcPr>
+          <w:p>
+            <w:pPr>
+              <w:spacing w:before="20" w:after="20" w:line="240" w:lineRule="auto"/>
+              <w:jc w:val="center"/>
+            </w:pPr>
+            <w:r/>
+            <w:r>
+              <w:rPr>
+                <w:rFonts w:ascii="Times New Roman" w:hAnsi="Times New Roman" w:eastAsia="Times New Roman"/>
+                <w:b w:val="0"/>
+                <w:i w:val="0"/>
+                <w:color w:val="171B22"/>
+                <w:sz w:val="16"/>
+              </w:rPr>
+              <w:t>Not significant</w:t>
+            </w:r>
+          </w:p>
+        </w:tc>
+      </w:tr>
+      <w:tr>
+        <w:tc>
+          <w:tcPr>
+            <w:tcW w:type="dxa" w:w="1984"/>
+            <w:tcBorders>
+              <w:top w:val="single" w:sz="4" w:color="B0A48A"/>
+              <w:left w:val="single" w:sz="4" w:color="B0A48A"/>
+              <w:bottom w:val="single" w:sz="4" w:color="B0A48A"/>
+              <w:right w:val="single" w:sz="4" w:color="B0A48A"/>
+            </w:tcBorders>
+          </w:tcPr>
+          <w:p>
+            <w:pPr>
+              <w:spacing w:before="20" w:after="20" w:line="240" w:lineRule="auto"/>
+            </w:pPr>
+            <w:r/>
+            <w:r>
+              <w:rPr>
+                <w:rFonts w:ascii="Times New Roman" w:hAnsi="Times New Roman" w:eastAsia="Times New Roman"/>
+                <w:b w:val="0"/>
+                <w:i w:val="0"/>
+                <w:color w:val="171B22"/>
+                <w:sz w:val="16"/>
+              </w:rPr>
+              <w:t>knockout</w:t>
+            </w:r>
+          </w:p>
+        </w:tc>
+        <w:tc>
+          <w:tcPr>
+            <w:tcW w:type="dxa" w:w="1191"/>
+            <w:tcBorders>
+              <w:top w:val="single" w:sz="4" w:color="B0A48A"/>
+              <w:left w:val="single" w:sz="4" w:color="B0A48A"/>
+              <w:bottom w:val="single" w:sz="4" w:color="B0A48A"/>
+              <w:right w:val="single" w:sz="4" w:color="B0A48A"/>
+            </w:tcBorders>
+          </w:tcPr>
+          <w:p>
+            <w:pPr>
+              <w:spacing w:before="20" w:after="20" w:line="240" w:lineRule="auto"/>
+              <w:jc w:val="center"/>
+            </w:pPr>
+            <w:r/>
+            <w:r>
+              <w:rPr>
+                <w:rFonts w:ascii="Times New Roman" w:hAnsi="Times New Roman" w:eastAsia="Times New Roman"/>
+                <w:b w:val="0"/>
+                <w:i w:val="0"/>
+                <w:color w:val="171B22"/>
+                <w:sz w:val="16"/>
+              </w:rPr>
+              <w:t>−0.726</w:t>
+            </w:r>
+          </w:p>
+        </w:tc>
+        <w:tc>
+          <w:tcPr>
+            <w:tcW w:type="dxa" w:w="1247"/>
+            <w:tcBorders>
+              <w:top w:val="single" w:sz="4" w:color="B0A48A"/>
+              <w:left w:val="single" w:sz="4" w:color="B0A48A"/>
+              <w:bottom w:val="single" w:sz="4" w:color="B0A48A"/>
+              <w:right w:val="single" w:sz="4" w:color="B0A48A"/>
+            </w:tcBorders>
+          </w:tcPr>
+          <w:p>
+            <w:pPr>
+              <w:spacing w:before="20" w:after="20" w:line="240" w:lineRule="auto"/>
+              <w:jc w:val="center"/>
+            </w:pPr>
+            <w:r/>
+            <w:r>
+              <w:rPr>
+                <w:rFonts w:ascii="Times New Roman" w:hAnsi="Times New Roman" w:eastAsia="Times New Roman"/>
+                <w:b w:val="0"/>
+                <w:i w:val="0"/>
+                <w:color w:val="171B22"/>
+                <w:sz w:val="16"/>
+              </w:rPr>
+              <w:t>0.097</w:t>
+            </w:r>
+          </w:p>
+        </w:tc>
+        <w:tc>
+          <w:tcPr>
+            <w:tcW w:type="dxa" w:w="5556"/>
+            <w:tcBorders>
+              <w:top w:val="single" w:sz="4" w:color="B0A48A"/>
+              <w:left w:val="single" w:sz="4" w:color="B0A48A"/>
+              <w:bottom w:val="single" w:sz="4" w:color="B0A48A"/>
+              <w:right w:val="single" w:sz="4" w:color="B0A48A"/>
+            </w:tcBorders>
+          </w:tcPr>
+          <w:p>
+            <w:pPr>
+              <w:spacing w:before="20" w:after="20" w:line="240" w:lineRule="auto"/>
+              <w:jc w:val="center"/>
+            </w:pPr>
+            <w:r/>
+            <w:r>
+              <w:rPr>
+                <w:rFonts w:ascii="Times New Roman" w:hAnsi="Times New Roman" w:eastAsia="Times New Roman"/>
+                <w:b w:val="0"/>
+                <w:i w:val="0"/>
+                <w:color w:val="171B22"/>
+                <w:sz w:val="16"/>
+              </w:rPr>
+              <w:t>Knockouts look tighter (only marginal)</w:t>
+            </w:r>
+          </w:p>
+        </w:tc>
+      </w:tr>
+      <w:tr>
+        <w:tc>
+          <w:tcPr>
+            <w:tcW w:type="dxa" w:w="1984"/>
+            <w:tcBorders>
+              <w:top w:val="single" w:sz="4" w:color="B0A48A"/>
+              <w:left w:val="single" w:sz="4" w:color="B0A48A"/>
+              <w:bottom w:val="single" w:sz="4" w:color="B0A48A"/>
+              <w:right w:val="single" w:sz="4" w:color="B0A48A"/>
+            </w:tcBorders>
+            <w:shd w:fill="F7F1E6" w:val="clear"/>
           </w:tcPr>
           <w:p>
             <w:pPr>
@@ -598,13 +1276,14 @@
         </w:tc>
         <w:tc>
           <w:tcPr>
-            <w:tcW w:type="dxa" w:w="1134"/>
+            <w:tcW w:type="dxa" w:w="1191"/>
             <w:tcBorders>
-              <w:top w:val="single" w:sz="4" w:color="C9BC9C"/>
-              <w:left w:val="single" w:sz="4" w:color="C9BC9C"/>
-              <w:bottom w:val="single" w:sz="4" w:color="C9BC9C"/>
-              <w:right w:val="single" w:sz="4" w:color="C9BC9C"/>
+              <w:top w:val="single" w:sz="4" w:color="B0A48A"/>
+              <w:left w:val="single" w:sz="4" w:color="B0A48A"/>
+              <w:bottom w:val="single" w:sz="4" w:color="B0A48A"/>
+              <w:right w:val="single" w:sz="4" w:color="B0A48A"/>
             </w:tcBorders>
+            <w:shd w:fill="F7F1E6" w:val="clear"/>
           </w:tcPr>
           <w:p>
             <w:pPr>
@@ -628,11 +1307,12 @@
           <w:tcPr>
             <w:tcW w:type="dxa" w:w="1247"/>
             <w:tcBorders>
-              <w:top w:val="single" w:sz="4" w:color="C9BC9C"/>
-              <w:left w:val="single" w:sz="4" w:color="C9BC9C"/>
-              <w:bottom w:val="single" w:sz="4" w:color="C9BC9C"/>
-              <w:right w:val="single" w:sz="4" w:color="C9BC9C"/>
+              <w:top w:val="single" w:sz="4" w:color="B0A48A"/>
+              <w:left w:val="single" w:sz="4" w:color="B0A48A"/>
+              <w:bottom w:val="single" w:sz="4" w:color="B0A48A"/>
+              <w:right w:val="single" w:sz="4" w:color="B0A48A"/>
             </w:tcBorders>
+            <w:shd w:fill="F7F1E6" w:val="clear"/>
           </w:tcPr>
           <w:p>
             <w:pPr>
@@ -654,70 +1334,12 @@
         </w:tc>
         <w:tc>
           <w:tcPr>
-            <w:tcW w:type="dxa" w:w="5783"/>
+            <w:tcW w:type="dxa" w:w="5556"/>
             <w:tcBorders>
-              <w:top w:val="single" w:sz="4" w:color="C9BC9C"/>
-              <w:left w:val="single" w:sz="4" w:color="C9BC9C"/>
-              <w:bottom w:val="single" w:sz="4" w:color="C9BC9C"/>
-              <w:right w:val="single" w:sz="4" w:color="C9BC9C"/>
-            </w:tcBorders>
-          </w:tcPr>
-          <w:p>
-            <w:pPr>
-              <w:spacing w:before="20" w:after="20" w:line="240" w:lineRule="auto"/>
-              <w:jc w:val="center"/>
-            </w:pPr>
-            <w:r/>
-            <w:r>
-              <w:rPr>
-                <w:rFonts w:ascii="Times New Roman" w:hAnsi="Times New Roman" w:eastAsia="Times New Roman"/>
-                <w:b w:val="0"/>
-                <w:i w:val="0"/>
-                <w:color w:val="171B22"/>
-                <w:sz w:val="16"/>
-              </w:rPr>
-              <w:t>Not significant</w:t>
-            </w:r>
-          </w:p>
-        </w:tc>
-      </w:tr>
-      <w:tr>
-        <w:tc>
-          <w:tcPr>
-            <w:tcW w:type="dxa" w:w="1928"/>
-            <w:tcBorders>
-              <w:top w:val="single" w:sz="4" w:color="C9BC9C"/>
-              <w:left w:val="single" w:sz="4" w:color="C9BC9C"/>
-              <w:bottom w:val="single" w:sz="4" w:color="C9BC9C"/>
-              <w:right w:val="single" w:sz="4" w:color="C9BC9C"/>
-            </w:tcBorders>
-            <w:shd w:fill="F7F1E6" w:val="clear"/>
-          </w:tcPr>
-          <w:p>
-            <w:pPr>
-              <w:spacing w:before="20" w:after="20" w:line="240" w:lineRule="auto"/>
-            </w:pPr>
-            <w:r/>
-            <w:r>
-              <w:rPr>
-                <w:rFonts w:ascii="Times New Roman" w:hAnsi="Times New Roman" w:eastAsia="Times New Roman"/>
-                <w:b w:val="0"/>
-                <w:i w:val="0"/>
-                <w:color w:val="171B22"/>
-                <w:sz w:val="16"/>
-              </w:rPr>
-              <w:t>value_diff *</w:t>
-            </w:r>
-          </w:p>
-        </w:tc>
-        <w:tc>
-          <w:tcPr>
-            <w:tcW w:type="dxa" w:w="1134"/>
-            <w:tcBorders>
-              <w:top w:val="single" w:sz="4" w:color="C9BC9C"/>
-              <w:left w:val="single" w:sz="4" w:color="C9BC9C"/>
-              <w:bottom w:val="single" w:sz="4" w:color="C9BC9C"/>
-              <w:right w:val="single" w:sz="4" w:color="C9BC9C"/>
+              <w:top w:val="single" w:sz="4" w:color="B0A48A"/>
+              <w:left w:val="single" w:sz="4" w:color="B0A48A"/>
+              <w:bottom w:val="single" w:sz="4" w:color="B0A48A"/>
+              <w:right w:val="single" w:sz="4" w:color="B0A48A"/>
             </w:tcBorders>
             <w:shd w:fill="F7F1E6" w:val="clear"/>
           </w:tcPr>
@@ -735,65 +1357,7 @@
                 <w:color w:val="171B22"/>
                 <w:sz w:val="16"/>
               </w:rPr>
-              <w:t>+0.0017</w:t>
-            </w:r>
-          </w:p>
-        </w:tc>
-        <w:tc>
-          <w:tcPr>
-            <w:tcW w:type="dxa" w:w="1247"/>
-            <w:tcBorders>
-              <w:top w:val="single" w:sz="4" w:color="C9BC9C"/>
-              <w:left w:val="single" w:sz="4" w:color="C9BC9C"/>
-              <w:bottom w:val="single" w:sz="4" w:color="C9BC9C"/>
-              <w:right w:val="single" w:sz="4" w:color="C9BC9C"/>
-            </w:tcBorders>
-            <w:shd w:fill="F7F1E6" w:val="clear"/>
-          </w:tcPr>
-          <w:p>
-            <w:pPr>
-              <w:spacing w:before="20" w:after="20" w:line="240" w:lineRule="auto"/>
-              <w:jc w:val="center"/>
-            </w:pPr>
-            <w:r/>
-            <w:r>
-              <w:rPr>
-                <w:rFonts w:ascii="Times New Roman" w:hAnsi="Times New Roman" w:eastAsia="Times New Roman"/>
-                <w:b w:val="0"/>
-                <w:i w:val="0"/>
-                <w:color w:val="171B22"/>
-                <w:sz w:val="16"/>
-              </w:rPr>
-              <w:t>0.004</w:t>
-            </w:r>
-          </w:p>
-        </w:tc>
-        <w:tc>
-          <w:tcPr>
-            <w:tcW w:type="dxa" w:w="5783"/>
-            <w:tcBorders>
-              <w:top w:val="single" w:sz="4" w:color="C9BC9C"/>
-              <w:left w:val="single" w:sz="4" w:color="C9BC9C"/>
-              <w:bottom w:val="single" w:sz="4" w:color="C9BC9C"/>
-              <w:right w:val="single" w:sz="4" w:color="C9BC9C"/>
-            </w:tcBorders>
-            <w:shd w:fill="F7F1E6" w:val="clear"/>
-          </w:tcPr>
-          <w:p>
-            <w:pPr>
-              <w:spacing w:before="20" w:after="20" w:line="240" w:lineRule="auto"/>
-              <w:jc w:val="center"/>
-            </w:pPr>
-            <w:r/>
-            <w:r>
-              <w:rPr>
-                <w:rFonts w:ascii="Times New Roman" w:hAnsi="Times New Roman" w:eastAsia="Times New Roman"/>
-                <w:b w:val="0"/>
-                <w:i w:val="0"/>
-                <w:color w:val="171B22"/>
-                <w:sz w:val="16"/>
-              </w:rPr>
-              <w:t>EUR 1 billion extra squad value ≈ +1.7 net goals</w:t>
+              <w:t>Not significant (unique to 2.1)</w:t>
             </w:r>
           </w:p>
         </w:tc>
@@ -801,12 +1365,12 @@
       <w:tr>
         <w:tc>
           <w:tcPr>
-            <w:tcW w:type="dxa" w:w="1928"/>
+            <w:tcW w:type="dxa" w:w="1984"/>
             <w:tcBorders>
-              <w:top w:val="single" w:sz="4" w:color="C9BC9C"/>
-              <w:left w:val="single" w:sz="4" w:color="C9BC9C"/>
-              <w:bottom w:val="single" w:sz="4" w:color="C9BC9C"/>
-              <w:right w:val="single" w:sz="4" w:color="C9BC9C"/>
+              <w:top w:val="single" w:sz="4" w:color="B0A48A"/>
+              <w:left w:val="single" w:sz="4" w:color="B0A48A"/>
+              <w:bottom w:val="single" w:sz="4" w:color="B0A48A"/>
+              <w:right w:val="single" w:sz="4" w:color="B0A48A"/>
             </w:tcBorders>
           </w:tcPr>
           <w:p>
@@ -828,12 +1392,12 @@
         </w:tc>
         <w:tc>
           <w:tcPr>
-            <w:tcW w:type="dxa" w:w="1134"/>
+            <w:tcW w:type="dxa" w:w="1191"/>
             <w:tcBorders>
-              <w:top w:val="single" w:sz="4" w:color="C9BC9C"/>
-              <w:left w:val="single" w:sz="4" w:color="C9BC9C"/>
-              <w:bottom w:val="single" w:sz="4" w:color="C9BC9C"/>
-              <w:right w:val="single" w:sz="4" w:color="C9BC9C"/>
+              <w:top w:val="single" w:sz="4" w:color="B0A48A"/>
+              <w:left w:val="single" w:sz="4" w:color="B0A48A"/>
+              <w:bottom w:val="single" w:sz="4" w:color="B0A48A"/>
+              <w:right w:val="single" w:sz="4" w:color="B0A48A"/>
             </w:tcBorders>
           </w:tcPr>
           <w:p>
@@ -858,10 +1422,10 @@
           <w:tcPr>
             <w:tcW w:type="dxa" w:w="1247"/>
             <w:tcBorders>
-              <w:top w:val="single" w:sz="4" w:color="C9BC9C"/>
-              <w:left w:val="single" w:sz="4" w:color="C9BC9C"/>
-              <w:bottom w:val="single" w:sz="4" w:color="C9BC9C"/>
-              <w:right w:val="single" w:sz="4" w:color="C9BC9C"/>
+              <w:top w:val="single" w:sz="4" w:color="B0A48A"/>
+              <w:left w:val="single" w:sz="4" w:color="B0A48A"/>
+              <w:bottom w:val="single" w:sz="4" w:color="B0A48A"/>
+              <w:right w:val="single" w:sz="4" w:color="B0A48A"/>
             </w:tcBorders>
           </w:tcPr>
           <w:p>
@@ -884,12 +1448,12 @@
         </w:tc>
         <w:tc>
           <w:tcPr>
-            <w:tcW w:type="dxa" w:w="5783"/>
+            <w:tcW w:type="dxa" w:w="5556"/>
             <w:tcBorders>
-              <w:top w:val="single" w:sz="4" w:color="C9BC9C"/>
-              <w:left w:val="single" w:sz="4" w:color="C9BC9C"/>
-              <w:bottom w:val="single" w:sz="4" w:color="C9BC9C"/>
-              <w:right w:val="single" w:sz="4" w:color="C9BC9C"/>
+              <w:top w:val="single" w:sz="4" w:color="B0A48A"/>
+              <w:left w:val="single" w:sz="4" w:color="B0A48A"/>
+              <w:bottom w:val="single" w:sz="4" w:color="B0A48A"/>
+              <w:right w:val="single" w:sz="4" w:color="B0A48A"/>
             </w:tcBorders>
           </w:tcPr>
           <w:p>
@@ -906,7 +1470,7 @@
                 <w:color w:val="171B22"/>
                 <w:sz w:val="16"/>
               </w:rPr>
-              <w:t>Past World Cup titles add nothing once rank and value are in</w:t>
+              <w:t>Not significant (unique to 2.1)</w:t>
             </w:r>
           </w:p>
         </w:tc>
@@ -914,12 +1478,12 @@
       <w:tr>
         <w:tc>
           <w:tcPr>
-            <w:tcW w:type="dxa" w:w="1928"/>
+            <w:tcW w:type="dxa" w:w="1984"/>
             <w:tcBorders>
-              <w:top w:val="single" w:sz="4" w:color="C9BC9C"/>
-              <w:left w:val="single" w:sz="4" w:color="C9BC9C"/>
-              <w:bottom w:val="single" w:sz="4" w:color="C9BC9C"/>
-              <w:right w:val="single" w:sz="4" w:color="C9BC9C"/>
+              <w:top w:val="single" w:sz="4" w:color="B0A48A"/>
+              <w:left w:val="single" w:sz="4" w:color="B0A48A"/>
+              <w:bottom w:val="single" w:sz="4" w:color="B0A48A"/>
+              <w:right w:val="single" w:sz="4" w:color="B0A48A"/>
             </w:tcBorders>
             <w:shd w:fill="F7F1E6" w:val="clear"/>
           </w:tcPr>
@@ -942,12 +1506,12 @@
         </w:tc>
         <w:tc>
           <w:tcPr>
-            <w:tcW w:type="dxa" w:w="1134"/>
+            <w:tcW w:type="dxa" w:w="1191"/>
             <w:tcBorders>
-              <w:top w:val="single" w:sz="4" w:color="C9BC9C"/>
-              <w:left w:val="single" w:sz="4" w:color="C9BC9C"/>
-              <w:bottom w:val="single" w:sz="4" w:color="C9BC9C"/>
-              <w:right w:val="single" w:sz="4" w:color="C9BC9C"/>
+              <w:top w:val="single" w:sz="4" w:color="B0A48A"/>
+              <w:left w:val="single" w:sz="4" w:color="B0A48A"/>
+              <w:bottom w:val="single" w:sz="4" w:color="B0A48A"/>
+              <w:right w:val="single" w:sz="4" w:color="B0A48A"/>
             </w:tcBorders>
             <w:shd w:fill="F7F1E6" w:val="clear"/>
           </w:tcPr>
@@ -973,10 +1537,10 @@
           <w:tcPr>
             <w:tcW w:type="dxa" w:w="1247"/>
             <w:tcBorders>
-              <w:top w:val="single" w:sz="4" w:color="C9BC9C"/>
-              <w:left w:val="single" w:sz="4" w:color="C9BC9C"/>
-              <w:bottom w:val="single" w:sz="4" w:color="C9BC9C"/>
-              <w:right w:val="single" w:sz="4" w:color="C9BC9C"/>
+              <w:top w:val="single" w:sz="4" w:color="B0A48A"/>
+              <w:left w:val="single" w:sz="4" w:color="B0A48A"/>
+              <w:bottom w:val="single" w:sz="4" w:color="B0A48A"/>
+              <w:right w:val="single" w:sz="4" w:color="B0A48A"/>
             </w:tcBorders>
             <w:shd w:fill="F7F1E6" w:val="clear"/>
           </w:tcPr>
@@ -1000,12 +1564,12 @@
         </w:tc>
         <w:tc>
           <w:tcPr>
-            <w:tcW w:type="dxa" w:w="5783"/>
+            <w:tcW w:type="dxa" w:w="5556"/>
             <w:tcBorders>
-              <w:top w:val="single" w:sz="4" w:color="C9BC9C"/>
-              <w:left w:val="single" w:sz="4" w:color="C9BC9C"/>
-              <w:bottom w:val="single" w:sz="4" w:color="C9BC9C"/>
-              <w:right w:val="single" w:sz="4" w:color="C9BC9C"/>
+              <w:top w:val="single" w:sz="4" w:color="B0A48A"/>
+              <w:left w:val="single" w:sz="4" w:color="B0A48A"/>
+              <w:bottom w:val="single" w:sz="4" w:color="B0A48A"/>
+              <w:right w:val="single" w:sz="4" w:color="B0A48A"/>
             </w:tcBorders>
             <w:shd w:fill="F7F1E6" w:val="clear"/>
           </w:tcPr>
@@ -1023,7 +1587,7 @@
                 <w:color w:val="171B22"/>
                 <w:sz w:val="16"/>
               </w:rPr>
-              <w:t>No clear co-host edge</w:t>
+              <w:t>Not significant (unique to 2.1)</w:t>
             </w:r>
           </w:p>
         </w:tc>
@@ -1031,127 +1595,13 @@
       <w:tr>
         <w:tc>
           <w:tcPr>
-            <w:tcW w:type="dxa" w:w="1928"/>
+            <w:tcW w:type="dxa" w:w="1984"/>
             <w:tcBorders>
-              <w:top w:val="single" w:sz="4" w:color="C9BC9C"/>
-              <w:left w:val="single" w:sz="4" w:color="C9BC9C"/>
-              <w:bottom w:val="single" w:sz="4" w:color="C9BC9C"/>
-              <w:right w:val="single" w:sz="4" w:color="C9BC9C"/>
+              <w:top w:val="single" w:sz="4" w:color="B0A48A"/>
+              <w:left w:val="single" w:sz="4" w:color="B0A48A"/>
+              <w:bottom w:val="single" w:sz="4" w:color="B0A48A"/>
+              <w:right w:val="single" w:sz="4" w:color="B0A48A"/>
             </w:tcBorders>
-          </w:tcPr>
-          <w:p>
-            <w:pPr>
-              <w:spacing w:before="20" w:after="20" w:line="240" w:lineRule="auto"/>
-            </w:pPr>
-            <w:r/>
-            <w:r>
-              <w:rPr>
-                <w:rFonts w:ascii="Times New Roman" w:hAnsi="Times New Roman" w:eastAsia="Times New Roman"/>
-                <w:b w:val="0"/>
-                <w:i w:val="0"/>
-                <w:color w:val="171B22"/>
-                <w:sz w:val="16"/>
-              </w:rPr>
-              <w:t>rest_diff</w:t>
-            </w:r>
-          </w:p>
-        </w:tc>
-        <w:tc>
-          <w:tcPr>
-            <w:tcW w:type="dxa" w:w="1134"/>
-            <w:tcBorders>
-              <w:top w:val="single" w:sz="4" w:color="C9BC9C"/>
-              <w:left w:val="single" w:sz="4" w:color="C9BC9C"/>
-              <w:bottom w:val="single" w:sz="4" w:color="C9BC9C"/>
-              <w:right w:val="single" w:sz="4" w:color="C9BC9C"/>
-            </w:tcBorders>
-          </w:tcPr>
-          <w:p>
-            <w:pPr>
-              <w:spacing w:before="20" w:after="20" w:line="240" w:lineRule="auto"/>
-              <w:jc w:val="center"/>
-            </w:pPr>
-            <w:r/>
-            <w:r>
-              <w:rPr>
-                <w:rFonts w:ascii="Times New Roman" w:hAnsi="Times New Roman" w:eastAsia="Times New Roman"/>
-                <w:b w:val="0"/>
-                <w:i w:val="0"/>
-                <w:color w:val="171B22"/>
-                <w:sz w:val="16"/>
-              </w:rPr>
-              <w:t>+0.172</w:t>
-            </w:r>
-          </w:p>
-        </w:tc>
-        <w:tc>
-          <w:tcPr>
-            <w:tcW w:type="dxa" w:w="1247"/>
-            <w:tcBorders>
-              <w:top w:val="single" w:sz="4" w:color="C9BC9C"/>
-              <w:left w:val="single" w:sz="4" w:color="C9BC9C"/>
-              <w:bottom w:val="single" w:sz="4" w:color="C9BC9C"/>
-              <w:right w:val="single" w:sz="4" w:color="C9BC9C"/>
-            </w:tcBorders>
-          </w:tcPr>
-          <w:p>
-            <w:pPr>
-              <w:spacing w:before="20" w:after="20" w:line="240" w:lineRule="auto"/>
-              <w:jc w:val="center"/>
-            </w:pPr>
-            <w:r/>
-            <w:r>
-              <w:rPr>
-                <w:rFonts w:ascii="Times New Roman" w:hAnsi="Times New Roman" w:eastAsia="Times New Roman"/>
-                <w:b w:val="0"/>
-                <w:i w:val="0"/>
-                <w:color w:val="171B22"/>
-                <w:sz w:val="16"/>
-              </w:rPr>
-              <w:t>0.641</w:t>
-            </w:r>
-          </w:p>
-        </w:tc>
-        <w:tc>
-          <w:tcPr>
-            <w:tcW w:type="dxa" w:w="5783"/>
-            <w:tcBorders>
-              <w:top w:val="single" w:sz="4" w:color="C9BC9C"/>
-              <w:left w:val="single" w:sz="4" w:color="C9BC9C"/>
-              <w:bottom w:val="single" w:sz="4" w:color="C9BC9C"/>
-              <w:right w:val="single" w:sz="4" w:color="C9BC9C"/>
-            </w:tcBorders>
-          </w:tcPr>
-          <w:p>
-            <w:pPr>
-              <w:spacing w:before="20" w:after="20" w:line="240" w:lineRule="auto"/>
-              <w:jc w:val="center"/>
-            </w:pPr>
-            <w:r/>
-            <w:r>
-              <w:rPr>
-                <w:rFonts w:ascii="Times New Roman" w:hAnsi="Times New Roman" w:eastAsia="Times New Roman"/>
-                <w:b w:val="0"/>
-                <w:i w:val="0"/>
-                <w:color w:val="171B22"/>
-                <w:sz w:val="16"/>
-              </w:rPr>
-              <w:t>Rest gap not significant</w:t>
-            </w:r>
-          </w:p>
-        </w:tc>
-      </w:tr>
-      <w:tr>
-        <w:tc>
-          <w:tcPr>
-            <w:tcW w:type="dxa" w:w="1928"/>
-            <w:tcBorders>
-              <w:top w:val="single" w:sz="4" w:color="C9BC9C"/>
-              <w:left w:val="single" w:sz="4" w:color="C9BC9C"/>
-              <w:bottom w:val="single" w:sz="4" w:color="C9BC9C"/>
-              <w:right w:val="single" w:sz="4" w:color="C9BC9C"/>
-            </w:tcBorders>
-            <w:shd w:fill="F7F1E6" w:val="clear"/>
           </w:tcPr>
           <w:p>
             <w:pPr>
@@ -1172,14 +1622,13 @@
         </w:tc>
         <w:tc>
           <w:tcPr>
-            <w:tcW w:type="dxa" w:w="1134"/>
+            <w:tcW w:type="dxa" w:w="1191"/>
             <w:tcBorders>
-              <w:top w:val="single" w:sz="4" w:color="C9BC9C"/>
-              <w:left w:val="single" w:sz="4" w:color="C9BC9C"/>
-              <w:bottom w:val="single" w:sz="4" w:color="C9BC9C"/>
-              <w:right w:val="single" w:sz="4" w:color="C9BC9C"/>
+              <w:top w:val="single" w:sz="4" w:color="B0A48A"/>
+              <w:left w:val="single" w:sz="4" w:color="B0A48A"/>
+              <w:bottom w:val="single" w:sz="4" w:color="B0A48A"/>
+              <w:right w:val="single" w:sz="4" w:color="B0A48A"/>
             </w:tcBorders>
-            <w:shd w:fill="F7F1E6" w:val="clear"/>
           </w:tcPr>
           <w:p>
             <w:pPr>
@@ -1203,12 +1652,11 @@
           <w:tcPr>
             <w:tcW w:type="dxa" w:w="1247"/>
             <w:tcBorders>
-              <w:top w:val="single" w:sz="4" w:color="C9BC9C"/>
-              <w:left w:val="single" w:sz="4" w:color="C9BC9C"/>
-              <w:bottom w:val="single" w:sz="4" w:color="C9BC9C"/>
-              <w:right w:val="single" w:sz="4" w:color="C9BC9C"/>
+              <w:top w:val="single" w:sz="4" w:color="B0A48A"/>
+              <w:left w:val="single" w:sz="4" w:color="B0A48A"/>
+              <w:bottom w:val="single" w:sz="4" w:color="B0A48A"/>
+              <w:right w:val="single" w:sz="4" w:color="B0A48A"/>
             </w:tcBorders>
-            <w:shd w:fill="F7F1E6" w:val="clear"/>
           </w:tcPr>
           <w:p>
             <w:pPr>
@@ -1230,70 +1678,12 @@
         </w:tc>
         <w:tc>
           <w:tcPr>
-            <w:tcW w:type="dxa" w:w="5783"/>
+            <w:tcW w:type="dxa" w:w="5556"/>
             <w:tcBorders>
-              <w:top w:val="single" w:sz="4" w:color="C9BC9C"/>
-              <w:left w:val="single" w:sz="4" w:color="C9BC9C"/>
-              <w:bottom w:val="single" w:sz="4" w:color="C9BC9C"/>
-              <w:right w:val="single" w:sz="4" w:color="C9BC9C"/>
-            </w:tcBorders>
-            <w:shd w:fill="F7F1E6" w:val="clear"/>
-          </w:tcPr>
-          <w:p>
-            <w:pPr>
-              <w:spacing w:before="20" w:after="20" w:line="240" w:lineRule="auto"/>
-              <w:jc w:val="center"/>
-            </w:pPr>
-            <w:r/>
-            <w:r>
-              <w:rPr>
-                <w:rFonts w:ascii="Times New Roman" w:hAnsi="Times New Roman" w:eastAsia="Times New Roman"/>
-                <w:b w:val="0"/>
-                <w:i w:val="0"/>
-                <w:color w:val="171B22"/>
-                <w:sz w:val="16"/>
-              </w:rPr>
-              <w:t>Same confederation not significant</w:t>
-            </w:r>
-          </w:p>
-        </w:tc>
-      </w:tr>
-      <w:tr>
-        <w:tc>
-          <w:tcPr>
-            <w:tcW w:type="dxa" w:w="1928"/>
-            <w:tcBorders>
-              <w:top w:val="single" w:sz="4" w:color="C9BC9C"/>
-              <w:left w:val="single" w:sz="4" w:color="C9BC9C"/>
-              <w:bottom w:val="single" w:sz="4" w:color="C9BC9C"/>
-              <w:right w:val="single" w:sz="4" w:color="C9BC9C"/>
-            </w:tcBorders>
-          </w:tcPr>
-          <w:p>
-            <w:pPr>
-              <w:spacing w:before="20" w:after="20" w:line="240" w:lineRule="auto"/>
-            </w:pPr>
-            <w:r/>
-            <w:r>
-              <w:rPr>
-                <w:rFonts w:ascii="Times New Roman" w:hAnsi="Times New Roman" w:eastAsia="Times New Roman"/>
-                <w:b w:val="0"/>
-                <w:i w:val="0"/>
-                <w:color w:val="171B22"/>
-                <w:sz w:val="16"/>
-              </w:rPr>
-              <w:t>knockout</w:t>
-            </w:r>
-          </w:p>
-        </w:tc>
-        <w:tc>
-          <w:tcPr>
-            <w:tcW w:type="dxa" w:w="1134"/>
-            <w:tcBorders>
-              <w:top w:val="single" w:sz="4" w:color="C9BC9C"/>
-              <w:left w:val="single" w:sz="4" w:color="C9BC9C"/>
-              <w:bottom w:val="single" w:sz="4" w:color="C9BC9C"/>
-              <w:right w:val="single" w:sz="4" w:color="C9BC9C"/>
+              <w:top w:val="single" w:sz="4" w:color="B0A48A"/>
+              <w:left w:val="single" w:sz="4" w:color="B0A48A"/>
+              <w:bottom w:val="single" w:sz="4" w:color="B0A48A"/>
+              <w:right w:val="single" w:sz="4" w:color="B0A48A"/>
             </w:tcBorders>
           </w:tcPr>
           <w:p>
@@ -1310,63 +1700,7 @@
                 <w:color w:val="171B22"/>
                 <w:sz w:val="16"/>
               </w:rPr>
-              <w:t>−0.726</w:t>
-            </w:r>
-          </w:p>
-        </w:tc>
-        <w:tc>
-          <w:tcPr>
-            <w:tcW w:type="dxa" w:w="1247"/>
-            <w:tcBorders>
-              <w:top w:val="single" w:sz="4" w:color="C9BC9C"/>
-              <w:left w:val="single" w:sz="4" w:color="C9BC9C"/>
-              <w:bottom w:val="single" w:sz="4" w:color="C9BC9C"/>
-              <w:right w:val="single" w:sz="4" w:color="C9BC9C"/>
-            </w:tcBorders>
-          </w:tcPr>
-          <w:p>
-            <w:pPr>
-              <w:spacing w:before="20" w:after="20" w:line="240" w:lineRule="auto"/>
-              <w:jc w:val="center"/>
-            </w:pPr>
-            <w:r/>
-            <w:r>
-              <w:rPr>
-                <w:rFonts w:ascii="Times New Roman" w:hAnsi="Times New Roman" w:eastAsia="Times New Roman"/>
-                <w:b w:val="0"/>
-                <w:i w:val="0"/>
-                <w:color w:val="171B22"/>
-                <w:sz w:val="16"/>
-              </w:rPr>
-              <w:t>0.097</w:t>
-            </w:r>
-          </w:p>
-        </w:tc>
-        <w:tc>
-          <w:tcPr>
-            <w:tcW w:type="dxa" w:w="5783"/>
-            <w:tcBorders>
-              <w:top w:val="single" w:sz="4" w:color="C9BC9C"/>
-              <w:left w:val="single" w:sz="4" w:color="C9BC9C"/>
-              <w:bottom w:val="single" w:sz="4" w:color="C9BC9C"/>
-              <w:right w:val="single" w:sz="4" w:color="C9BC9C"/>
-            </w:tcBorders>
-          </w:tcPr>
-          <w:p>
-            <w:pPr>
-              <w:spacing w:before="20" w:after="20" w:line="240" w:lineRule="auto"/>
-              <w:jc w:val="center"/>
-            </w:pPr>
-            <w:r/>
-            <w:r>
-              <w:rPr>
-                <w:rFonts w:ascii="Times New Roman" w:hAnsi="Times New Roman" w:eastAsia="Times New Roman"/>
-                <w:b w:val="0"/>
-                <w:i w:val="0"/>
-                <w:color w:val="171B22"/>
-                <w:sz w:val="16"/>
-              </w:rPr>
-              <w:t>Knockouts trend tighter (marginal, p &lt; 0.10)</w:t>
+              <w:t>Not significant (unique to 2.1)</w:t>
             </w:r>
           </w:p>
         </w:tc>
@@ -1379,7 +1713,7 @@
     </w:p>
     <w:p>
       <w:pPr>
-        <w:spacing w:before="0" w:after="80" w:line="240" w:lineRule="auto"/>
+        <w:spacing w:before="0" w:after="100" w:line="240" w:lineRule="auto"/>
         <w:jc w:val="both"/>
       </w:pPr>
       <w:r>
@@ -1390,12 +1724,12 @@
           <w:color w:val="171B22"/>
           <w:sz w:val="20"/>
         </w:rPr>
-        <w:t>Only rank_diff and value_diff are significant at 5%. The rank coefficient is negative because rank 1 is better than rank 20: if team 1 is stronger, rank_diff is negative, and a negative coefficient times a negative gap predicts a positive goal difference for team 1. Value works in the obvious direction: the richer squad is expected to outscore the poorer one. Age, titles, host, rest and confederation are not significant after rank and value are included. Knockout has a negative coefficient (tighter games) but p = 0.097, so we treat it as a hint, not a finding.</w:t>
+        <w:t>Only rank_diff and value_diff are significant at 5%. rank_diff is negative because rank 1 is better than rank 20. If team 1 is stronger, rank_diff is negative; a negative coefficient then predicts a positive goal difference for team 1. Value has the expected sign: the richer squad is predicted to outscore the poorer one. Age, titles, host and same confederation add little once rank and value are in the model. We keep them because the brief asked for eight thoughtful variables, not a hunt for small p-values.</w:t>
       </w:r>
     </w:p>
     <w:p>
       <w:pPr>
-        <w:spacing w:before="160" w:after="60" w:line="240" w:lineRule="auto"/>
+        <w:spacing w:before="140" w:after="40" w:line="240" w:lineRule="auto"/>
       </w:pPr>
       <w:r>
         <w:rPr>
@@ -1405,12 +1739,12 @@
           <w:color w:val="6E2129"/>
           <w:sz w:val="22"/>
         </w:rPr>
-        <w:t>4. Model 2.2 — goals scored by one team (n = 208)</w:t>
+        <w:t>4. Linear Regression 2.2 — goals scored by one team (208 rows)</w:t>
       </w:r>
     </w:p>
     <w:p>
       <w:pPr>
-        <w:spacing w:before="0" w:after="80" w:line="240" w:lineRule="auto"/>
+        <w:spacing w:before="0" w:after="100" w:line="240" w:lineRule="auto"/>
         <w:jc w:val="both"/>
       </w:pPr>
       <w:r>
@@ -1421,7 +1755,7 @@
           <w:color w:val="171B22"/>
           <w:sz w:val="20"/>
         </w:rPr>
-        <w:t>Target: goals scored by that team in that match. Two rows per match. Training set 166 rows, test set 42 rows. Training R² = 0.264 (adjusted R² = 0.227). Test R² = 0.074, RMSE = 1.34 goals, MAE = 1.01 goals. Test fit is weak. That is expected once we are not allowed to reuse opponent rank or opponent value from Model 2.1, and because an exact tally is noisier than a goal difference. We still report it honestly rather than recycling extra shared predictors to inflate R².</w:t>
+        <w:t>Target: goals scored by that team in that match. Training n = 166, test n = 42. Training R² = 0.264 (adjusted R² = 0.227). Test R² = 0.074, RMSE = 1.34, MAE = 1.01. Test fit is weak. Two reasons: counting one team’s goals is noisier than a match margin, and the sharing rule stops us putting opponent rank or opponent value into this model as well. We report the weak test R² rather than breaking the four-shared limit.</w:t>
       </w:r>
     </w:p>
     <w:tbl>
@@ -1432,20 +1766,20 @@
         <w:tblLook w:firstColumn="1" w:firstRow="1" w:lastColumn="0" w:lastRow="0" w:noHBand="0" w:noVBand="1" w:val="04A0"/>
       </w:tblPr>
       <w:tblGrid>
-        <w:gridCol w:w="2523"/>
-        <w:gridCol w:w="2523"/>
-        <w:gridCol w:w="2523"/>
-        <w:gridCol w:w="2523"/>
+        <w:gridCol w:w="2494"/>
+        <w:gridCol w:w="2494"/>
+        <w:gridCol w:w="2494"/>
+        <w:gridCol w:w="2494"/>
       </w:tblGrid>
       <w:tr>
         <w:tc>
           <w:tcPr>
-            <w:tcW w:type="dxa" w:w="1928"/>
+            <w:tcW w:type="dxa" w:w="1984"/>
             <w:tcBorders>
-              <w:top w:val="single" w:sz="4" w:color="C9BC9C"/>
-              <w:left w:val="single" w:sz="4" w:color="C9BC9C"/>
-              <w:bottom w:val="single" w:sz="4" w:color="C9BC9C"/>
-              <w:right w:val="single" w:sz="4" w:color="C9BC9C"/>
+              <w:top w:val="single" w:sz="4" w:color="B0A48A"/>
+              <w:left w:val="single" w:sz="4" w:color="B0A48A"/>
+              <w:bottom w:val="single" w:sz="4" w:color="B0A48A"/>
+              <w:right w:val="single" w:sz="4" w:color="B0A48A"/>
             </w:tcBorders>
             <w:shd w:fill="EFE6D3" w:val="clear"/>
           </w:tcPr>
@@ -1469,12 +1803,12 @@
         </w:tc>
         <w:tc>
           <w:tcPr>
-            <w:tcW w:type="dxa" w:w="1134"/>
+            <w:tcW w:type="dxa" w:w="1191"/>
             <w:tcBorders>
-              <w:top w:val="single" w:sz="4" w:color="C9BC9C"/>
-              <w:left w:val="single" w:sz="4" w:color="C9BC9C"/>
-              <w:bottom w:val="single" w:sz="4" w:color="C9BC9C"/>
-              <w:right w:val="single" w:sz="4" w:color="C9BC9C"/>
+              <w:top w:val="single" w:sz="4" w:color="B0A48A"/>
+              <w:left w:val="single" w:sz="4" w:color="B0A48A"/>
+              <w:bottom w:val="single" w:sz="4" w:color="B0A48A"/>
+              <w:right w:val="single" w:sz="4" w:color="B0A48A"/>
             </w:tcBorders>
             <w:shd w:fill="EFE6D3" w:val="clear"/>
           </w:tcPr>
@@ -1500,10 +1834,10 @@
           <w:tcPr>
             <w:tcW w:type="dxa" w:w="1247"/>
             <w:tcBorders>
-              <w:top w:val="single" w:sz="4" w:color="C9BC9C"/>
-              <w:left w:val="single" w:sz="4" w:color="C9BC9C"/>
-              <w:bottom w:val="single" w:sz="4" w:color="C9BC9C"/>
-              <w:right w:val="single" w:sz="4" w:color="C9BC9C"/>
+              <w:top w:val="single" w:sz="4" w:color="B0A48A"/>
+              <w:left w:val="single" w:sz="4" w:color="B0A48A"/>
+              <w:bottom w:val="single" w:sz="4" w:color="B0A48A"/>
+              <w:right w:val="single" w:sz="4" w:color="B0A48A"/>
             </w:tcBorders>
             <w:shd w:fill="EFE6D3" w:val="clear"/>
           </w:tcPr>
@@ -1527,12 +1861,12 @@
         </w:tc>
         <w:tc>
           <w:tcPr>
-            <w:tcW w:type="dxa" w:w="5783"/>
+            <w:tcW w:type="dxa" w:w="5556"/>
             <w:tcBorders>
-              <w:top w:val="single" w:sz="4" w:color="C9BC9C"/>
-              <w:left w:val="single" w:sz="4" w:color="C9BC9C"/>
-              <w:bottom w:val="single" w:sz="4" w:color="C9BC9C"/>
-              <w:right w:val="single" w:sz="4" w:color="C9BC9C"/>
+              <w:top w:val="single" w:sz="4" w:color="B0A48A"/>
+              <w:left w:val="single" w:sz="4" w:color="B0A48A"/>
+              <w:bottom w:val="single" w:sz="4" w:color="B0A48A"/>
+              <w:right w:val="single" w:sz="4" w:color="B0A48A"/>
             </w:tcBorders>
             <w:shd w:fill="EFE6D3" w:val="clear"/>
           </w:tcPr>
@@ -1550,7 +1884,7 @@
                 <w:color w:val="171B22"/>
                 <w:sz w:val="16"/>
               </w:rPr>
-              <w:t>Reading in plain English</w:t>
+              <w:t>Meaning</w:t>
             </w:r>
           </w:p>
         </w:tc>
@@ -1558,12 +1892,12 @@
       <w:tr>
         <w:tc>
           <w:tcPr>
-            <w:tcW w:type="dxa" w:w="1928"/>
+            <w:tcW w:type="dxa" w:w="1984"/>
             <w:tcBorders>
-              <w:top w:val="single" w:sz="4" w:color="C9BC9C"/>
-              <w:left w:val="single" w:sz="4" w:color="C9BC9C"/>
-              <w:bottom w:val="single" w:sz="4" w:color="C9BC9C"/>
-              <w:right w:val="single" w:sz="4" w:color="C9BC9C"/>
+              <w:top w:val="single" w:sz="4" w:color="B0A48A"/>
+              <w:left w:val="single" w:sz="4" w:color="B0A48A"/>
+              <w:bottom w:val="single" w:sz="4" w:color="B0A48A"/>
+              <w:right w:val="single" w:sz="4" w:color="B0A48A"/>
             </w:tcBorders>
           </w:tcPr>
           <w:p>
@@ -1585,12 +1919,12 @@
         </w:tc>
         <w:tc>
           <w:tcPr>
-            <w:tcW w:type="dxa" w:w="1134"/>
+            <w:tcW w:type="dxa" w:w="1191"/>
             <w:tcBorders>
-              <w:top w:val="single" w:sz="4" w:color="C9BC9C"/>
-              <w:left w:val="single" w:sz="4" w:color="C9BC9C"/>
-              <w:bottom w:val="single" w:sz="4" w:color="C9BC9C"/>
-              <w:right w:val="single" w:sz="4" w:color="C9BC9C"/>
+              <w:top w:val="single" w:sz="4" w:color="B0A48A"/>
+              <w:left w:val="single" w:sz="4" w:color="B0A48A"/>
+              <w:bottom w:val="single" w:sz="4" w:color="B0A48A"/>
+              <w:right w:val="single" w:sz="4" w:color="B0A48A"/>
             </w:tcBorders>
           </w:tcPr>
           <w:p>
@@ -1615,10 +1949,10 @@
           <w:tcPr>
             <w:tcW w:type="dxa" w:w="1247"/>
             <w:tcBorders>
-              <w:top w:val="single" w:sz="4" w:color="C9BC9C"/>
-              <w:left w:val="single" w:sz="4" w:color="C9BC9C"/>
-              <w:bottom w:val="single" w:sz="4" w:color="C9BC9C"/>
-              <w:right w:val="single" w:sz="4" w:color="C9BC9C"/>
+              <w:top w:val="single" w:sz="4" w:color="B0A48A"/>
+              <w:left w:val="single" w:sz="4" w:color="B0A48A"/>
+              <w:bottom w:val="single" w:sz="4" w:color="B0A48A"/>
+              <w:right w:val="single" w:sz="4" w:color="B0A48A"/>
             </w:tcBorders>
           </w:tcPr>
           <w:p>
@@ -1641,12 +1975,12 @@
         </w:tc>
         <w:tc>
           <w:tcPr>
-            <w:tcW w:type="dxa" w:w="5783"/>
+            <w:tcW w:type="dxa" w:w="5556"/>
             <w:tcBorders>
-              <w:top w:val="single" w:sz="4" w:color="C9BC9C"/>
-              <w:left w:val="single" w:sz="4" w:color="C9BC9C"/>
-              <w:bottom w:val="single" w:sz="4" w:color="C9BC9C"/>
-              <w:right w:val="single" w:sz="4" w:color="C9BC9C"/>
+              <w:top w:val="single" w:sz="4" w:color="B0A48A"/>
+              <w:left w:val="single" w:sz="4" w:color="B0A48A"/>
+              <w:bottom w:val="single" w:sz="4" w:color="B0A48A"/>
+              <w:right w:val="single" w:sz="4" w:color="B0A48A"/>
             </w:tcBorders>
           </w:tcPr>
           <w:p>
@@ -1671,12 +2005,12 @@
       <w:tr>
         <w:tc>
           <w:tcPr>
-            <w:tcW w:type="dxa" w:w="1928"/>
+            <w:tcW w:type="dxa" w:w="1984"/>
             <w:tcBorders>
-              <w:top w:val="single" w:sz="4" w:color="C9BC9C"/>
-              <w:left w:val="single" w:sz="4" w:color="C9BC9C"/>
-              <w:bottom w:val="single" w:sz="4" w:color="C9BC9C"/>
-              <w:right w:val="single" w:sz="4" w:color="C9BC9C"/>
+              <w:top w:val="single" w:sz="4" w:color="B0A48A"/>
+              <w:left w:val="single" w:sz="4" w:color="B0A48A"/>
+              <w:bottom w:val="single" w:sz="4" w:color="B0A48A"/>
+              <w:right w:val="single" w:sz="4" w:color="B0A48A"/>
             </w:tcBorders>
             <w:shd w:fill="F7F1E6" w:val="clear"/>
           </w:tcPr>
@@ -1699,12 +2033,12 @@
         </w:tc>
         <w:tc>
           <w:tcPr>
-            <w:tcW w:type="dxa" w:w="1134"/>
+            <w:tcW w:type="dxa" w:w="1191"/>
             <w:tcBorders>
-              <w:top w:val="single" w:sz="4" w:color="C9BC9C"/>
-              <w:left w:val="single" w:sz="4" w:color="C9BC9C"/>
-              <w:bottom w:val="single" w:sz="4" w:color="C9BC9C"/>
-              <w:right w:val="single" w:sz="4" w:color="C9BC9C"/>
+              <w:top w:val="single" w:sz="4" w:color="B0A48A"/>
+              <w:left w:val="single" w:sz="4" w:color="B0A48A"/>
+              <w:bottom w:val="single" w:sz="4" w:color="B0A48A"/>
+              <w:right w:val="single" w:sz="4" w:color="B0A48A"/>
             </w:tcBorders>
             <w:shd w:fill="F7F1E6" w:val="clear"/>
           </w:tcPr>
@@ -1730,10 +2064,10 @@
           <w:tcPr>
             <w:tcW w:type="dxa" w:w="1247"/>
             <w:tcBorders>
-              <w:top w:val="single" w:sz="4" w:color="C9BC9C"/>
-              <w:left w:val="single" w:sz="4" w:color="C9BC9C"/>
-              <w:bottom w:val="single" w:sz="4" w:color="C9BC9C"/>
-              <w:right w:val="single" w:sz="4" w:color="C9BC9C"/>
+              <w:top w:val="single" w:sz="4" w:color="B0A48A"/>
+              <w:left w:val="single" w:sz="4" w:color="B0A48A"/>
+              <w:bottom w:val="single" w:sz="4" w:color="B0A48A"/>
+              <w:right w:val="single" w:sz="4" w:color="B0A48A"/>
             </w:tcBorders>
             <w:shd w:fill="F7F1E6" w:val="clear"/>
           </w:tcPr>
@@ -1757,12 +2091,12 @@
         </w:tc>
         <w:tc>
           <w:tcPr>
-            <w:tcW w:type="dxa" w:w="5783"/>
+            <w:tcW w:type="dxa" w:w="5556"/>
             <w:tcBorders>
-              <w:top w:val="single" w:sz="4" w:color="C9BC9C"/>
-              <w:left w:val="single" w:sz="4" w:color="C9BC9C"/>
-              <w:bottom w:val="single" w:sz="4" w:color="C9BC9C"/>
-              <w:right w:val="single" w:sz="4" w:color="C9BC9C"/>
+              <w:top w:val="single" w:sz="4" w:color="B0A48A"/>
+              <w:left w:val="single" w:sz="4" w:color="B0A48A"/>
+              <w:bottom w:val="single" w:sz="4" w:color="B0A48A"/>
+              <w:right w:val="single" w:sz="4" w:color="B0A48A"/>
             </w:tcBorders>
             <w:shd w:fill="F7F1E6" w:val="clear"/>
           </w:tcPr>
@@ -1780,7 +2114,7 @@
                 <w:color w:val="171B22"/>
                 <w:sz w:val="16"/>
               </w:rPr>
-              <w:t>Better own rank (smaller number) → more goals</w:t>
+              <w:t>Better own rank → more goals (shared idea: rank)</w:t>
             </w:r>
           </w:p>
         </w:tc>
@@ -1788,12 +2122,12 @@
       <w:tr>
         <w:tc>
           <w:tcPr>
-            <w:tcW w:type="dxa" w:w="1928"/>
+            <w:tcW w:type="dxa" w:w="1984"/>
             <w:tcBorders>
-              <w:top w:val="single" w:sz="4" w:color="C9BC9C"/>
-              <w:left w:val="single" w:sz="4" w:color="C9BC9C"/>
-              <w:bottom w:val="single" w:sz="4" w:color="C9BC9C"/>
-              <w:right w:val="single" w:sz="4" w:color="C9BC9C"/>
+              <w:top w:val="single" w:sz="4" w:color="B0A48A"/>
+              <w:left w:val="single" w:sz="4" w:color="B0A48A"/>
+              <w:bottom w:val="single" w:sz="4" w:color="B0A48A"/>
+              <w:right w:val="single" w:sz="4" w:color="B0A48A"/>
             </w:tcBorders>
           </w:tcPr>
           <w:p>
@@ -1815,12 +2149,12 @@
         </w:tc>
         <w:tc>
           <w:tcPr>
-            <w:tcW w:type="dxa" w:w="1134"/>
+            <w:tcW w:type="dxa" w:w="1191"/>
             <w:tcBorders>
-              <w:top w:val="single" w:sz="4" w:color="C9BC9C"/>
-              <w:left w:val="single" w:sz="4" w:color="C9BC9C"/>
-              <w:bottom w:val="single" w:sz="4" w:color="C9BC9C"/>
-              <w:right w:val="single" w:sz="4" w:color="C9BC9C"/>
+              <w:top w:val="single" w:sz="4" w:color="B0A48A"/>
+              <w:left w:val="single" w:sz="4" w:color="B0A48A"/>
+              <w:bottom w:val="single" w:sz="4" w:color="B0A48A"/>
+              <w:right w:val="single" w:sz="4" w:color="B0A48A"/>
             </w:tcBorders>
           </w:tcPr>
           <w:p>
@@ -1845,10 +2179,10 @@
           <w:tcPr>
             <w:tcW w:type="dxa" w:w="1247"/>
             <w:tcBorders>
-              <w:top w:val="single" w:sz="4" w:color="C9BC9C"/>
-              <w:left w:val="single" w:sz="4" w:color="C9BC9C"/>
-              <w:bottom w:val="single" w:sz="4" w:color="C9BC9C"/>
-              <w:right w:val="single" w:sz="4" w:color="C9BC9C"/>
+              <w:top w:val="single" w:sz="4" w:color="B0A48A"/>
+              <w:left w:val="single" w:sz="4" w:color="B0A48A"/>
+              <w:bottom w:val="single" w:sz="4" w:color="B0A48A"/>
+              <w:right w:val="single" w:sz="4" w:color="B0A48A"/>
             </w:tcBorders>
           </w:tcPr>
           <w:p>
@@ -1871,12 +2205,12 @@
         </w:tc>
         <w:tc>
           <w:tcPr>
-            <w:tcW w:type="dxa" w:w="5783"/>
+            <w:tcW w:type="dxa" w:w="5556"/>
             <w:tcBorders>
-              <w:top w:val="single" w:sz="4" w:color="C9BC9C"/>
-              <w:left w:val="single" w:sz="4" w:color="C9BC9C"/>
-              <w:bottom w:val="single" w:sz="4" w:color="C9BC9C"/>
-              <w:right w:val="single" w:sz="4" w:color="C9BC9C"/>
+              <w:top w:val="single" w:sz="4" w:color="B0A48A"/>
+              <w:left w:val="single" w:sz="4" w:color="B0A48A"/>
+              <w:bottom w:val="single" w:sz="4" w:color="B0A48A"/>
+              <w:right w:val="single" w:sz="4" w:color="B0A48A"/>
             </w:tcBorders>
           </w:tcPr>
           <w:p>
@@ -1893,7 +2227,7 @@
                 <w:color w:val="171B22"/>
                 <w:sz w:val="16"/>
               </w:rPr>
-              <w:t>Not significant once rank is in</w:t>
+              <w:t>Not significant (shared idea: value)</w:t>
             </w:r>
           </w:p>
         </w:tc>
@@ -1901,12 +2235,12 @@
       <w:tr>
         <w:tc>
           <w:tcPr>
-            <w:tcW w:type="dxa" w:w="1928"/>
+            <w:tcW w:type="dxa" w:w="1984"/>
             <w:tcBorders>
-              <w:top w:val="single" w:sz="4" w:color="C9BC9C"/>
-              <w:left w:val="single" w:sz="4" w:color="C9BC9C"/>
-              <w:bottom w:val="single" w:sz="4" w:color="C9BC9C"/>
-              <w:right w:val="single" w:sz="4" w:color="C9BC9C"/>
+              <w:top w:val="single" w:sz="4" w:color="B0A48A"/>
+              <w:left w:val="single" w:sz="4" w:color="B0A48A"/>
+              <w:bottom w:val="single" w:sz="4" w:color="B0A48A"/>
+              <w:right w:val="single" w:sz="4" w:color="B0A48A"/>
             </w:tcBorders>
             <w:shd w:fill="F7F1E6" w:val="clear"/>
           </w:tcPr>
@@ -1929,12 +2263,12 @@
         </w:tc>
         <w:tc>
           <w:tcPr>
-            <w:tcW w:type="dxa" w:w="1134"/>
+            <w:tcW w:type="dxa" w:w="1191"/>
             <w:tcBorders>
-              <w:top w:val="single" w:sz="4" w:color="C9BC9C"/>
-              <w:left w:val="single" w:sz="4" w:color="C9BC9C"/>
-              <w:bottom w:val="single" w:sz="4" w:color="C9BC9C"/>
-              <w:right w:val="single" w:sz="4" w:color="C9BC9C"/>
+              <w:top w:val="single" w:sz="4" w:color="B0A48A"/>
+              <w:left w:val="single" w:sz="4" w:color="B0A48A"/>
+              <w:bottom w:val="single" w:sz="4" w:color="B0A48A"/>
+              <w:right w:val="single" w:sz="4" w:color="B0A48A"/>
             </w:tcBorders>
             <w:shd w:fill="F7F1E6" w:val="clear"/>
           </w:tcPr>
@@ -1960,10 +2294,10 @@
           <w:tcPr>
             <w:tcW w:type="dxa" w:w="1247"/>
             <w:tcBorders>
-              <w:top w:val="single" w:sz="4" w:color="C9BC9C"/>
-              <w:left w:val="single" w:sz="4" w:color="C9BC9C"/>
-              <w:bottom w:val="single" w:sz="4" w:color="C9BC9C"/>
-              <w:right w:val="single" w:sz="4" w:color="C9BC9C"/>
+              <w:top w:val="single" w:sz="4" w:color="B0A48A"/>
+              <w:left w:val="single" w:sz="4" w:color="B0A48A"/>
+              <w:bottom w:val="single" w:sz="4" w:color="B0A48A"/>
+              <w:right w:val="single" w:sz="4" w:color="B0A48A"/>
             </w:tcBorders>
             <w:shd w:fill="F7F1E6" w:val="clear"/>
           </w:tcPr>
@@ -1987,12 +2321,12 @@
         </w:tc>
         <w:tc>
           <w:tcPr>
-            <w:tcW w:type="dxa" w:w="5783"/>
+            <w:tcW w:type="dxa" w:w="5556"/>
             <w:tcBorders>
-              <w:top w:val="single" w:sz="4" w:color="C9BC9C"/>
-              <w:left w:val="single" w:sz="4" w:color="C9BC9C"/>
-              <w:bottom w:val="single" w:sz="4" w:color="C9BC9C"/>
-              <w:right w:val="single" w:sz="4" w:color="C9BC9C"/>
+              <w:top w:val="single" w:sz="4" w:color="B0A48A"/>
+              <w:left w:val="single" w:sz="4" w:color="B0A48A"/>
+              <w:bottom w:val="single" w:sz="4" w:color="B0A48A"/>
+              <w:right w:val="single" w:sz="4" w:color="B0A48A"/>
             </w:tcBorders>
             <w:shd w:fill="F7F1E6" w:val="clear"/>
           </w:tcPr>
@@ -2010,7 +2344,7 @@
                 <w:color w:val="171B22"/>
                 <w:sz w:val="16"/>
               </w:rPr>
-              <w:t>Not significant</w:t>
+              <w:t>Not significant (shared idea: rest)</w:t>
             </w:r>
           </w:p>
         </w:tc>
@@ -2018,12 +2352,12 @@
       <w:tr>
         <w:tc>
           <w:tcPr>
-            <w:tcW w:type="dxa" w:w="1928"/>
+            <w:tcW w:type="dxa" w:w="1984"/>
             <w:tcBorders>
-              <w:top w:val="single" w:sz="4" w:color="C9BC9C"/>
-              <w:left w:val="single" w:sz="4" w:color="C9BC9C"/>
-              <w:bottom w:val="single" w:sz="4" w:color="C9BC9C"/>
-              <w:right w:val="single" w:sz="4" w:color="C9BC9C"/>
+              <w:top w:val="single" w:sz="4" w:color="B0A48A"/>
+              <w:left w:val="single" w:sz="4" w:color="B0A48A"/>
+              <w:bottom w:val="single" w:sz="4" w:color="B0A48A"/>
+              <w:right w:val="single" w:sz="4" w:color="B0A48A"/>
             </w:tcBorders>
           </w:tcPr>
           <w:p>
@@ -2045,12 +2379,12 @@
         </w:tc>
         <w:tc>
           <w:tcPr>
-            <w:tcW w:type="dxa" w:w="1134"/>
+            <w:tcW w:type="dxa" w:w="1191"/>
             <w:tcBorders>
-              <w:top w:val="single" w:sz="4" w:color="C9BC9C"/>
-              <w:left w:val="single" w:sz="4" w:color="C9BC9C"/>
-              <w:bottom w:val="single" w:sz="4" w:color="C9BC9C"/>
-              <w:right w:val="single" w:sz="4" w:color="C9BC9C"/>
+              <w:top w:val="single" w:sz="4" w:color="B0A48A"/>
+              <w:left w:val="single" w:sz="4" w:color="B0A48A"/>
+              <w:bottom w:val="single" w:sz="4" w:color="B0A48A"/>
+              <w:right w:val="single" w:sz="4" w:color="B0A48A"/>
             </w:tcBorders>
           </w:tcPr>
           <w:p>
@@ -2075,10 +2409,10 @@
           <w:tcPr>
             <w:tcW w:type="dxa" w:w="1247"/>
             <w:tcBorders>
-              <w:top w:val="single" w:sz="4" w:color="C9BC9C"/>
-              <w:left w:val="single" w:sz="4" w:color="C9BC9C"/>
-              <w:bottom w:val="single" w:sz="4" w:color="C9BC9C"/>
-              <w:right w:val="single" w:sz="4" w:color="C9BC9C"/>
+              <w:top w:val="single" w:sz="4" w:color="B0A48A"/>
+              <w:left w:val="single" w:sz="4" w:color="B0A48A"/>
+              <w:bottom w:val="single" w:sz="4" w:color="B0A48A"/>
+              <w:right w:val="single" w:sz="4" w:color="B0A48A"/>
             </w:tcBorders>
           </w:tcPr>
           <w:p>
@@ -2101,12 +2435,12 @@
         </w:tc>
         <w:tc>
           <w:tcPr>
-            <w:tcW w:type="dxa" w:w="5783"/>
+            <w:tcW w:type="dxa" w:w="5556"/>
             <w:tcBorders>
-              <w:top w:val="single" w:sz="4" w:color="C9BC9C"/>
-              <w:left w:val="single" w:sz="4" w:color="C9BC9C"/>
-              <w:bottom w:val="single" w:sz="4" w:color="C9BC9C"/>
-              <w:right w:val="single" w:sz="4" w:color="C9BC9C"/>
+              <w:top w:val="single" w:sz="4" w:color="B0A48A"/>
+              <w:left w:val="single" w:sz="4" w:color="B0A48A"/>
+              <w:bottom w:val="single" w:sz="4" w:color="B0A48A"/>
+              <w:right w:val="single" w:sz="4" w:color="B0A48A"/>
             </w:tcBorders>
           </w:tcPr>
           <w:p>
@@ -2123,7 +2457,7 @@
                 <w:color w:val="171B22"/>
                 <w:sz w:val="16"/>
               </w:rPr>
-              <w:t>Not significant</w:t>
+              <w:t>Not significant (shared idea: knockout)</w:t>
             </w:r>
           </w:p>
         </w:tc>
@@ -2131,12 +2465,12 @@
       <w:tr>
         <w:tc>
           <w:tcPr>
-            <w:tcW w:type="dxa" w:w="1928"/>
+            <w:tcW w:type="dxa" w:w="1984"/>
             <w:tcBorders>
-              <w:top w:val="single" w:sz="4" w:color="C9BC9C"/>
-              <w:left w:val="single" w:sz="4" w:color="C9BC9C"/>
-              <w:bottom w:val="single" w:sz="4" w:color="C9BC9C"/>
-              <w:right w:val="single" w:sz="4" w:color="C9BC9C"/>
+              <w:top w:val="single" w:sz="4" w:color="B0A48A"/>
+              <w:left w:val="single" w:sz="4" w:color="B0A48A"/>
+              <w:bottom w:val="single" w:sz="4" w:color="B0A48A"/>
+              <w:right w:val="single" w:sz="4" w:color="B0A48A"/>
             </w:tcBorders>
             <w:shd w:fill="F7F1E6" w:val="clear"/>
           </w:tcPr>
@@ -2159,12 +2493,12 @@
         </w:tc>
         <w:tc>
           <w:tcPr>
-            <w:tcW w:type="dxa" w:w="1134"/>
+            <w:tcW w:type="dxa" w:w="1191"/>
             <w:tcBorders>
-              <w:top w:val="single" w:sz="4" w:color="C9BC9C"/>
-              <w:left w:val="single" w:sz="4" w:color="C9BC9C"/>
-              <w:bottom w:val="single" w:sz="4" w:color="C9BC9C"/>
-              <w:right w:val="single" w:sz="4" w:color="C9BC9C"/>
+              <w:top w:val="single" w:sz="4" w:color="B0A48A"/>
+              <w:left w:val="single" w:sz="4" w:color="B0A48A"/>
+              <w:bottom w:val="single" w:sz="4" w:color="B0A48A"/>
+              <w:right w:val="single" w:sz="4" w:color="B0A48A"/>
             </w:tcBorders>
             <w:shd w:fill="F7F1E6" w:val="clear"/>
           </w:tcPr>
@@ -2190,10 +2524,10 @@
           <w:tcPr>
             <w:tcW w:type="dxa" w:w="1247"/>
             <w:tcBorders>
-              <w:top w:val="single" w:sz="4" w:color="C9BC9C"/>
-              <w:left w:val="single" w:sz="4" w:color="C9BC9C"/>
-              <w:bottom w:val="single" w:sz="4" w:color="C9BC9C"/>
-              <w:right w:val="single" w:sz="4" w:color="C9BC9C"/>
+              <w:top w:val="single" w:sz="4" w:color="B0A48A"/>
+              <w:left w:val="single" w:sz="4" w:color="B0A48A"/>
+              <w:bottom w:val="single" w:sz="4" w:color="B0A48A"/>
+              <w:right w:val="single" w:sz="4" w:color="B0A48A"/>
             </w:tcBorders>
             <w:shd w:fill="F7F1E6" w:val="clear"/>
           </w:tcPr>
@@ -2217,12 +2551,12 @@
         </w:tc>
         <w:tc>
           <w:tcPr>
-            <w:tcW w:type="dxa" w:w="5783"/>
+            <w:tcW w:type="dxa" w:w="5556"/>
             <w:tcBorders>
-              <w:top w:val="single" w:sz="4" w:color="C9BC9C"/>
-              <w:left w:val="single" w:sz="4" w:color="C9BC9C"/>
-              <w:bottom w:val="single" w:sz="4" w:color="C9BC9C"/>
-              <w:right w:val="single" w:sz="4" w:color="C9BC9C"/>
+              <w:top w:val="single" w:sz="4" w:color="B0A48A"/>
+              <w:left w:val="single" w:sz="4" w:color="B0A48A"/>
+              <w:bottom w:val="single" w:sz="4" w:color="B0A48A"/>
+              <w:right w:val="single" w:sz="4" w:color="B0A48A"/>
             </w:tcBorders>
             <w:shd w:fill="F7F1E6" w:val="clear"/>
           </w:tcPr>
@@ -2240,7 +2574,7 @@
                 <w:color w:val="171B22"/>
                 <w:sz w:val="16"/>
               </w:rPr>
-              <w:t>Own prior WC appearances not significant</w:t>
+              <w:t>Own prior WC appearances (unique to 2.2)</w:t>
             </w:r>
           </w:p>
         </w:tc>
@@ -2248,12 +2582,12 @@
       <w:tr>
         <w:tc>
           <w:tcPr>
-            <w:tcW w:type="dxa" w:w="1928"/>
+            <w:tcW w:type="dxa" w:w="1984"/>
             <w:tcBorders>
-              <w:top w:val="single" w:sz="4" w:color="C9BC9C"/>
-              <w:left w:val="single" w:sz="4" w:color="C9BC9C"/>
-              <w:bottom w:val="single" w:sz="4" w:color="C9BC9C"/>
-              <w:right w:val="single" w:sz="4" w:color="C9BC9C"/>
+              <w:top w:val="single" w:sz="4" w:color="B0A48A"/>
+              <w:left w:val="single" w:sz="4" w:color="B0A48A"/>
+              <w:bottom w:val="single" w:sz="4" w:color="B0A48A"/>
+              <w:right w:val="single" w:sz="4" w:color="B0A48A"/>
             </w:tcBorders>
           </w:tcPr>
           <w:p>
@@ -2275,12 +2609,12 @@
         </w:tc>
         <w:tc>
           <w:tcPr>
-            <w:tcW w:type="dxa" w:w="1134"/>
+            <w:tcW w:type="dxa" w:w="1191"/>
             <w:tcBorders>
-              <w:top w:val="single" w:sz="4" w:color="C9BC9C"/>
-              <w:left w:val="single" w:sz="4" w:color="C9BC9C"/>
-              <w:bottom w:val="single" w:sz="4" w:color="C9BC9C"/>
-              <w:right w:val="single" w:sz="4" w:color="C9BC9C"/>
+              <w:top w:val="single" w:sz="4" w:color="B0A48A"/>
+              <w:left w:val="single" w:sz="4" w:color="B0A48A"/>
+              <w:bottom w:val="single" w:sz="4" w:color="B0A48A"/>
+              <w:right w:val="single" w:sz="4" w:color="B0A48A"/>
             </w:tcBorders>
           </w:tcPr>
           <w:p>
@@ -2305,10 +2639,10 @@
           <w:tcPr>
             <w:tcW w:type="dxa" w:w="1247"/>
             <w:tcBorders>
-              <w:top w:val="single" w:sz="4" w:color="C9BC9C"/>
-              <w:left w:val="single" w:sz="4" w:color="C9BC9C"/>
-              <w:bottom w:val="single" w:sz="4" w:color="C9BC9C"/>
-              <w:right w:val="single" w:sz="4" w:color="C9BC9C"/>
+              <w:top w:val="single" w:sz="4" w:color="B0A48A"/>
+              <w:left w:val="single" w:sz="4" w:color="B0A48A"/>
+              <w:bottom w:val="single" w:sz="4" w:color="B0A48A"/>
+              <w:right w:val="single" w:sz="4" w:color="B0A48A"/>
             </w:tcBorders>
           </w:tcPr>
           <w:p>
@@ -2331,12 +2665,12 @@
         </w:tc>
         <w:tc>
           <w:tcPr>
-            <w:tcW w:type="dxa" w:w="5783"/>
+            <w:tcW w:type="dxa" w:w="5556"/>
             <w:tcBorders>
-              <w:top w:val="single" w:sz="4" w:color="C9BC9C"/>
-              <w:left w:val="single" w:sz="4" w:color="C9BC9C"/>
-              <w:bottom w:val="single" w:sz="4" w:color="C9BC9C"/>
-              <w:right w:val="single" w:sz="4" w:color="C9BC9C"/>
+              <w:top w:val="single" w:sz="4" w:color="B0A48A"/>
+              <w:left w:val="single" w:sz="4" w:color="B0A48A"/>
+              <w:bottom w:val="single" w:sz="4" w:color="B0A48A"/>
+              <w:right w:val="single" w:sz="4" w:color="B0A48A"/>
             </w:tcBorders>
           </w:tcPr>
           <w:p>
@@ -2353,7 +2687,7 @@
                 <w:color w:val="171B22"/>
                 <w:sz w:val="16"/>
               </w:rPr>
-              <w:t>More-experienced opponent → fewer goals</w:t>
+              <w:t>More WC history for opponent → fewer goals</w:t>
             </w:r>
           </w:p>
         </w:tc>
@@ -2361,12 +2695,12 @@
       <w:tr>
         <w:tc>
           <w:tcPr>
-            <w:tcW w:type="dxa" w:w="1928"/>
+            <w:tcW w:type="dxa" w:w="1984"/>
             <w:tcBorders>
-              <w:top w:val="single" w:sz="4" w:color="C9BC9C"/>
-              <w:left w:val="single" w:sz="4" w:color="C9BC9C"/>
-              <w:bottom w:val="single" w:sz="4" w:color="C9BC9C"/>
-              <w:right w:val="single" w:sz="4" w:color="C9BC9C"/>
+              <w:top w:val="single" w:sz="4" w:color="B0A48A"/>
+              <w:left w:val="single" w:sz="4" w:color="B0A48A"/>
+              <w:bottom w:val="single" w:sz="4" w:color="B0A48A"/>
+              <w:right w:val="single" w:sz="4" w:color="B0A48A"/>
             </w:tcBorders>
             <w:shd w:fill="F7F1E6" w:val="clear"/>
           </w:tcPr>
@@ -2389,12 +2723,12 @@
         </w:tc>
         <w:tc>
           <w:tcPr>
-            <w:tcW w:type="dxa" w:w="1134"/>
+            <w:tcW w:type="dxa" w:w="1191"/>
             <w:tcBorders>
-              <w:top w:val="single" w:sz="4" w:color="C9BC9C"/>
-              <w:left w:val="single" w:sz="4" w:color="C9BC9C"/>
-              <w:bottom w:val="single" w:sz="4" w:color="C9BC9C"/>
-              <w:right w:val="single" w:sz="4" w:color="C9BC9C"/>
+              <w:top w:val="single" w:sz="4" w:color="B0A48A"/>
+              <w:left w:val="single" w:sz="4" w:color="B0A48A"/>
+              <w:bottom w:val="single" w:sz="4" w:color="B0A48A"/>
+              <w:right w:val="single" w:sz="4" w:color="B0A48A"/>
             </w:tcBorders>
             <w:shd w:fill="F7F1E6" w:val="clear"/>
           </w:tcPr>
@@ -2420,10 +2754,10 @@
           <w:tcPr>
             <w:tcW w:type="dxa" w:w="1247"/>
             <w:tcBorders>
-              <w:top w:val="single" w:sz="4" w:color="C9BC9C"/>
-              <w:left w:val="single" w:sz="4" w:color="C9BC9C"/>
-              <w:bottom w:val="single" w:sz="4" w:color="C9BC9C"/>
-              <w:right w:val="single" w:sz="4" w:color="C9BC9C"/>
+              <w:top w:val="single" w:sz="4" w:color="B0A48A"/>
+              <w:left w:val="single" w:sz="4" w:color="B0A48A"/>
+              <w:bottom w:val="single" w:sz="4" w:color="B0A48A"/>
+              <w:right w:val="single" w:sz="4" w:color="B0A48A"/>
             </w:tcBorders>
             <w:shd w:fill="F7F1E6" w:val="clear"/>
           </w:tcPr>
@@ -2447,12 +2781,12 @@
         </w:tc>
         <w:tc>
           <w:tcPr>
-            <w:tcW w:type="dxa" w:w="5783"/>
+            <w:tcW w:type="dxa" w:w="5556"/>
             <w:tcBorders>
-              <w:top w:val="single" w:sz="4" w:color="C9BC9C"/>
-              <w:left w:val="single" w:sz="4" w:color="C9BC9C"/>
-              <w:bottom w:val="single" w:sz="4" w:color="C9BC9C"/>
-              <w:right w:val="single" w:sz="4" w:color="C9BC9C"/>
+              <w:top w:val="single" w:sz="4" w:color="B0A48A"/>
+              <w:left w:val="single" w:sz="4" w:color="B0A48A"/>
+              <w:bottom w:val="single" w:sz="4" w:color="B0A48A"/>
+              <w:right w:val="single" w:sz="4" w:color="B0A48A"/>
             </w:tcBorders>
             <w:shd w:fill="F7F1E6" w:val="clear"/>
           </w:tcPr>
@@ -2470,7 +2804,7 @@
                 <w:color w:val="171B22"/>
                 <w:sz w:val="16"/>
               </w:rPr>
-              <w:t>Not significant</w:t>
+              <w:t>UEFA dummy (unique to 2.2), not significant</w:t>
             </w:r>
           </w:p>
         </w:tc>
@@ -2478,12 +2812,12 @@
       <w:tr>
         <w:tc>
           <w:tcPr>
-            <w:tcW w:type="dxa" w:w="1928"/>
+            <w:tcW w:type="dxa" w:w="1984"/>
             <w:tcBorders>
-              <w:top w:val="single" w:sz="4" w:color="C9BC9C"/>
-              <w:left w:val="single" w:sz="4" w:color="C9BC9C"/>
-              <w:bottom w:val="single" w:sz="4" w:color="C9BC9C"/>
-              <w:right w:val="single" w:sz="4" w:color="C9BC9C"/>
+              <w:top w:val="single" w:sz="4" w:color="B0A48A"/>
+              <w:left w:val="single" w:sz="4" w:color="B0A48A"/>
+              <w:bottom w:val="single" w:sz="4" w:color="B0A48A"/>
+              <w:right w:val="single" w:sz="4" w:color="B0A48A"/>
             </w:tcBorders>
           </w:tcPr>
           <w:p>
@@ -2505,12 +2839,12 @@
         </w:tc>
         <w:tc>
           <w:tcPr>
-            <w:tcW w:type="dxa" w:w="1134"/>
+            <w:tcW w:type="dxa" w:w="1191"/>
             <w:tcBorders>
-              <w:top w:val="single" w:sz="4" w:color="C9BC9C"/>
-              <w:left w:val="single" w:sz="4" w:color="C9BC9C"/>
-              <w:bottom w:val="single" w:sz="4" w:color="C9BC9C"/>
-              <w:right w:val="single" w:sz="4" w:color="C9BC9C"/>
+              <w:top w:val="single" w:sz="4" w:color="B0A48A"/>
+              <w:left w:val="single" w:sz="4" w:color="B0A48A"/>
+              <w:bottom w:val="single" w:sz="4" w:color="B0A48A"/>
+              <w:right w:val="single" w:sz="4" w:color="B0A48A"/>
             </w:tcBorders>
           </w:tcPr>
           <w:p>
@@ -2535,10 +2869,10 @@
           <w:tcPr>
             <w:tcW w:type="dxa" w:w="1247"/>
             <w:tcBorders>
-              <w:top w:val="single" w:sz="4" w:color="C9BC9C"/>
-              <w:left w:val="single" w:sz="4" w:color="C9BC9C"/>
-              <w:bottom w:val="single" w:sz="4" w:color="C9BC9C"/>
-              <w:right w:val="single" w:sz="4" w:color="C9BC9C"/>
+              <w:top w:val="single" w:sz="4" w:color="B0A48A"/>
+              <w:left w:val="single" w:sz="4" w:color="B0A48A"/>
+              <w:bottom w:val="single" w:sz="4" w:color="B0A48A"/>
+              <w:right w:val="single" w:sz="4" w:color="B0A48A"/>
             </w:tcBorders>
           </w:tcPr>
           <w:p>
@@ -2561,12 +2895,12 @@
         </w:tc>
         <w:tc>
           <w:tcPr>
-            <w:tcW w:type="dxa" w:w="5783"/>
+            <w:tcW w:type="dxa" w:w="5556"/>
             <w:tcBorders>
-              <w:top w:val="single" w:sz="4" w:color="C9BC9C"/>
-              <w:left w:val="single" w:sz="4" w:color="C9BC9C"/>
-              <w:bottom w:val="single" w:sz="4" w:color="C9BC9C"/>
-              <w:right w:val="single" w:sz="4" w:color="C9BC9C"/>
+              <w:top w:val="single" w:sz="4" w:color="B0A48A"/>
+              <w:left w:val="single" w:sz="4" w:color="B0A48A"/>
+              <w:bottom w:val="single" w:sz="4" w:color="B0A48A"/>
+              <w:right w:val="single" w:sz="4" w:color="B0A48A"/>
             </w:tcBorders>
           </w:tcPr>
           <w:p>
@@ -2583,7 +2917,7 @@
                 <w:color w:val="171B22"/>
                 <w:sz w:val="16"/>
               </w:rPr>
-              <w:t>Schedule day not significant</w:t>
+              <w:t>Schedule day (unique to 2.2), not significant</w:t>
             </w:r>
           </w:p>
         </w:tc>
@@ -2596,7 +2930,7 @@
     </w:p>
     <w:p>
       <w:pPr>
-        <w:spacing w:before="0" w:after="80" w:line="240" w:lineRule="auto"/>
+        <w:spacing w:before="0" w:after="100" w:line="240" w:lineRule="auto"/>
         <w:jc w:val="both"/>
       </w:pPr>
       <w:r>
@@ -2607,18 +2941,18 @@
           <w:color w:val="171B22"/>
           <w:sz w:val="20"/>
         </w:rPr>
-        <w:t>Two coefficients are significant at 5%: own FIFA rank and the opponent’s prior World Cup appearances. A better-ranked team scores more. A more experienced opponent (more past tournaments) is associated with about 0.06 fewer goals per extra appearance. Squad value, UEFA membership and calendar day are not significant after those two are included.</w:t>
+        <w:t>Two coefficients are significant: team_rank and opp_appearances. A better-ranked team scores more. Facing an opponent with more previous World Cups is linked to about 0.06 fewer goals per extra appearance. Value, rest, knockout, UEFA and calendar day are not significant after those two.</w:t>
       </w:r>
     </w:p>
     <w:p>
       <w:pPr>
-        <w:spacing w:before="40" w:after="40"/>
+        <w:spacing w:before="60" w:after="20"/>
         <w:jc w:val="center"/>
       </w:pPr>
       <w:r>
         <w:drawing>
           <wp:inline xmlns:a="http://schemas.openxmlformats.org/drawingml/2006/main" xmlns:pic="http://schemas.openxmlformats.org/drawingml/2006/picture">
-            <wp:extent cx="2880360" cy="2884258"/>
+            <wp:extent cx="2834640" cy="2838476"/>
             <wp:docPr id="1" name="Picture 1"/>
             <wp:cNvGraphicFramePr>
               <a:graphicFrameLocks noChangeAspect="1"/>
@@ -2639,7 +2973,7 @@
                   <pic:spPr>
                     <a:xfrm>
                       <a:off x="0" y="0"/>
-                      <a:ext cx="2880360" cy="2884258"/>
+                      <a:ext cx="2834640" cy="2838476"/>
                     </a:xfrm>
                     <a:prstGeom prst="rect"/>
                   </pic:spPr>
@@ -2650,19 +2984,12 @@
         </w:drawing>
       </w:r>
       <w:r>
-        <w:rPr>
-          <w:rFonts w:ascii="Times New Roman" w:hAnsi="Times New Roman" w:eastAsia="Times New Roman"/>
-          <w:b w:val="0"/>
-          <w:i w:val="0"/>
-          <w:color w:val="171B22"/>
-          <w:sz w:val="20"/>
-        </w:rPr>
         <w:t xml:space="preserve">  </w:t>
       </w:r>
       <w:r>
         <w:drawing>
           <wp:inline xmlns:a="http://schemas.openxmlformats.org/drawingml/2006/main" xmlns:pic="http://schemas.openxmlformats.org/drawingml/2006/picture">
-            <wp:extent cx="2880360" cy="2880360"/>
+            <wp:extent cx="2834640" cy="2834640"/>
             <wp:docPr id="2" name="Picture 2"/>
             <wp:cNvGraphicFramePr>
               <a:graphicFrameLocks noChangeAspect="1"/>
@@ -2683,7 +3010,7 @@
                   <pic:spPr>
                     <a:xfrm>
                       <a:off x="0" y="0"/>
-                      <a:ext cx="2880360" cy="2880360"/>
+                      <a:ext cx="2834640" cy="2834640"/>
                     </a:xfrm>
                     <a:prstGeom prst="rect"/>
                   </pic:spPr>
@@ -2696,7 +3023,7 @@
     </w:p>
     <w:p>
       <w:pPr>
-        <w:spacing w:before="0" w:after="120" w:line="240" w:lineRule="auto"/>
+        <w:spacing w:before="0" w:after="100" w:line="240" w:lineRule="auto"/>
         <w:jc w:val="center"/>
       </w:pPr>
       <w:r>
@@ -2707,12 +3034,12 @@
           <w:color w:val="171B22"/>
           <w:sz w:val="16"/>
         </w:rPr>
-        <w:t>Figure 1. Test-set predicted versus actual values. Left: Model 2.1 goal difference. Right: Model 2.2 team goals. The dashed line is a perfect prediction. Points scatter around the line; Model 2.1 tracks the diagonal more tightly.</w:t>
+        <w:t>Figure 1. Test set: predicted versus actual. Left = Model 2.1 (goal difference). Right = Model 2.2 (goals scored). The dashed line is a perfect prediction. Charts were produced in Python by assignment3_final_code.py.</w:t>
       </w:r>
     </w:p>
     <w:p>
       <w:pPr>
-        <w:spacing w:before="160" w:after="60" w:line="240" w:lineRule="auto"/>
+        <w:spacing w:before="140" w:after="40" w:line="240" w:lineRule="auto"/>
       </w:pPr>
       <w:r>
         <w:rPr>
@@ -2722,7 +3049,7 @@
           <w:color w:val="6E2129"/>
           <w:sz w:val="22"/>
         </w:rPr>
-        <w:t>5. Diagnostics, comparison and limitations</w:t>
+        <w:t>5. Diagnostics, limitations and conclusion</w:t>
       </w:r>
     </w:p>
     <w:p>
@@ -2738,7 +3065,7 @@
           <w:color w:val="171B22"/>
           <w:sz w:val="20"/>
         </w:rPr>
-        <w:t>Multicollinearity: largest VIF excluding the intercept is 3.30 in Model 2.1 and 3.44 in Model 2.2, both below 5. Shapiro–Wilk on training residuals: p = 0.937 for Model 2.1 (compatible with normality) and p = 0.017 for Model 2.2 (residuals not normal). Goals are a small count (0, 1, 2, 3…), so OLS is a blunt tool; the brief asked for linear regression, which is why we still use it. Poisson would be a natural next step for Model 2.2.</w:t>
+        <w:t>VIF (excluding the intercept) is at most 3.30 in Model 2.1 and 3.44 in Model 2.2, so collinearity is not a problem. Shapiro–Wilk on training residuals: p = 0.937 for 2.1 (consistent with normal residuals) and p = 0.017 for 2.2 (not normal). Goals are 0, 1, 2, 3… so OLS is a rough tool. The brief asked for linear regression, so we used OLS. A Poisson model would be a fair next step for 2.2.</w:t>
       </w:r>
     </w:p>
     <w:p>
@@ -2754,27 +3081,12 @@
           <w:color w:val="171B22"/>
           <w:sz w:val="20"/>
         </w:rPr>
-        <w:t>Limitations. (1) The 208 rows in Model 2.2 are not fully independent, because two rows share a match; this can make standard errors look too small. Model 2.1 does not have that problem. (2) Transfermarkt values and average ages are a snapshot and can move a few percent with the pull date. Rankings, scores and titles do not. (3) The test set for Model 2.1 is only 21 matches, so test R² = 0.306 should be read as a rough check, not a precise claim. (4) We pre-specified eight substantively motivated predictors rather than dropping variables until every p-value was below 0.05. Age, titles and host mostly dropping out is a result, not a failure. (5) Rest-day imputation for first matches is a simple median fill; it is honest but blunt.</w:t>
+        <w:t>Limitations: (1) The 208 rows in 2.2 are not independent, because two rows come from the same match. (2) Transfermarkt values and ages are a snapshot. Rankings, scores and titles are not. (3) Test n = 21 in 2.1 is small. (4) First-match rest is a median fill. (5) We chose eight variables in advance; dropping the non-significant ones after seeing p-values would be p-hacking.</w:t>
       </w:r>
     </w:p>
     <w:p>
       <w:pPr>
-        <w:spacing w:before="160" w:after="60" w:line="240" w:lineRule="auto"/>
-      </w:pPr>
-      <w:r>
-        <w:rPr>
-          <w:rFonts w:ascii="Times New Roman" w:hAnsi="Times New Roman" w:eastAsia="Times New Roman"/>
-          <w:b/>
-          <w:i w:val="0"/>
-          <w:color w:val="6E2129"/>
-          <w:sz w:val="22"/>
-        </w:rPr>
-        <w:t>6. Conclusion</w:t>
-      </w:r>
-    </w:p>
-    <w:p>
-      <w:pPr>
-        <w:spacing w:before="0" w:after="80" w:line="240" w:lineRule="auto"/>
+        <w:spacing w:before="0" w:after="40" w:line="240" w:lineRule="auto"/>
         <w:jc w:val="both"/>
       </w:pPr>
       <w:r>
@@ -2785,27 +3097,12 @@
           <w:color w:val="171B22"/>
           <w:sz w:val="20"/>
         </w:rPr>
-        <w:t>Before kick-off, FIFA ranking is the most consistent signal. In Model 2.1, rank_diff and value_diff are the only 5% significant drivers of goal difference; a billion-euro value edge is about +1.7 net goals after rank is held fixed. In Model 2.2, after we keep only four shared ideas, a team scores more when it is better ranked and scores less against opponents with more World Cup history. Test R² is much higher for goal difference (0.31) than for a single team’s tally (0.07). That gap is partly the harder target, and partly the four-variable sharing rule, which stops us putting opponent rank into both models. We would next try a Poisson model for 2.2, still with the same eight pre-match predictors.</w:t>
-      </w:r>
-    </w:p>
-    <w:p>
-      <w:pPr>
-        <w:spacing w:before="0" w:after="0" w:line="240" w:lineRule="auto"/>
-      </w:pPr>
-      <w:r>
-        <w:rPr>
-          <w:rFonts w:ascii="Times New Roman" w:hAnsi="Times New Roman" w:eastAsia="Times New Roman"/>
-          <w:b w:val="0"/>
-          <w:i/>
-          <w:color w:val="171B22"/>
-          <w:sz w:val="18"/>
-        </w:rPr>
-        <w:t>Word count of the body is within the four-page A4, 10 pt, single-spaced limit. Figures are produced by the same Python file that fits the models.</w:t>
+        <w:t>Conclusion. With only pre-match information, FIFA ranking is the most stable signal. Model 2.1: rank gap and squad-value gap are the significant drivers of goal difference. Model 2.2: own rank and the opponent’s World Cup history are the significant drivers of goals scored. The goal-difference model predicts held-out matches much better (test R² 0.31 versus 0.07), both because a margin is easier than a count and because the sharing rule blocks opponent rank from appearing in both models.</w:t>
       </w:r>
     </w:p>
     <w:sectPr>
       <w:pgSz w:w="11906" w:h="16838"/>
-      <w:pgMar w:top="794" w:right="907" w:bottom="794" w:left="907" w:header="720" w:footer="720" w:gutter="0"/>
+      <w:pgMar w:top="850" w:right="964" w:bottom="850" w:left="964" w:header="720" w:footer="720" w:gutter="0"/>
       <w:cols w:space="720"/>
       <w:docGrid w:linePitch="360"/>
     </w:sectPr>
@@ -3176,9 +3473,6 @@
     <w:name w:val="Normal"/>
     <w:qFormat/>
     <w:rsid w:val="00FC693F"/>
-    <w:pPr>
-      <w:spacing w:line="240" w:lineRule="auto"/>
-    </w:pPr>
     <w:rPr>
       <w:rFonts w:ascii="Times New Roman" w:hAnsi="Times New Roman"/>
       <w:sz w:val="20"/>

</xml_diff>